<commit_message>
docs: finalize reference list
</commit_message>
<xml_diff>
--- a/docs/Proposal.docx
+++ b/docs/Proposal.docx
@@ -1,6 +1,6 @@
 
 <file path=word/document.xml><?xml version="1.0" encoding="utf-8"?>
-<w:document xmlns:wpc="http://schemas.microsoft.com/office/word/2010/wordprocessingCanvas" xmlns:mc="http://schemas.openxmlformats.org/markup-compatibility/2006" xmlns:o="urn:schemas-microsoft-com:office:office" xmlns:r="http://schemas.openxmlformats.org/officeDocument/2006/relationships" xmlns:m="http://schemas.openxmlformats.org/officeDocument/2006/math" xmlns:v="urn:schemas-microsoft-com:vml" xmlns:wp14="http://schemas.microsoft.com/office/word/2010/wordprocessingDrawing" xmlns:wp="http://schemas.openxmlformats.org/drawingml/2006/wordprocessingDrawing" xmlns:w10="urn:schemas-microsoft-com:office:word" xmlns:w="http://schemas.openxmlformats.org/wordprocessingml/2006/main" xmlns:w14="http://schemas.microsoft.com/office/word/2010/wordml" xmlns:w15="http://schemas.microsoft.com/office/word/2012/wordml" xmlns:wpg="http://schemas.microsoft.com/office/word/2010/wordprocessingGroup" xmlns:wpi="http://schemas.microsoft.com/office/word/2010/wordprocessingInk" xmlns:wne="http://schemas.microsoft.com/office/word/2006/wordml" xmlns:wps="http://schemas.microsoft.com/office/word/2010/wordprocessingShape" mc:Ignorable="w14 w15 wp14">
+<w:document xmlns:wpc="http://schemas.microsoft.com/office/word/2010/wordprocessingCanvas" xmlns:cx="http://schemas.microsoft.com/office/drawing/2014/chartex" xmlns:cx1="http://schemas.microsoft.com/office/drawing/2015/9/8/chartex" xmlns:cx2="http://schemas.microsoft.com/office/drawing/2015/10/21/chartex" xmlns:cx3="http://schemas.microsoft.com/office/drawing/2016/5/9/chartex" xmlns:cx4="http://schemas.microsoft.com/office/drawing/2016/5/10/chartex" xmlns:cx5="http://schemas.microsoft.com/office/drawing/2016/5/11/chartex" xmlns:cx6="http://schemas.microsoft.com/office/drawing/2016/5/12/chartex" xmlns:cx7="http://schemas.microsoft.com/office/drawing/2016/5/13/chartex" xmlns:cx8="http://schemas.microsoft.com/office/drawing/2016/5/14/chartex" xmlns:mc="http://schemas.openxmlformats.org/markup-compatibility/2006" xmlns:aink="http://schemas.microsoft.com/office/drawing/2016/ink" xmlns:am3d="http://schemas.microsoft.com/office/drawing/2017/model3d" xmlns:o="urn:schemas-microsoft-com:office:office" xmlns:oel="http://schemas.microsoft.com/office/2019/extlst" xmlns:r="http://schemas.openxmlformats.org/officeDocument/2006/relationships" xmlns:m="http://schemas.openxmlformats.org/officeDocument/2006/math" xmlns:v="urn:schemas-microsoft-com:vml" xmlns:wp14="http://schemas.microsoft.com/office/word/2010/wordprocessingDrawing" xmlns:wp="http://schemas.openxmlformats.org/drawingml/2006/wordprocessingDrawing" xmlns:w10="urn:schemas-microsoft-com:office:word" xmlns:w="http://schemas.openxmlformats.org/wordprocessingml/2006/main" xmlns:w14="http://schemas.microsoft.com/office/word/2010/wordml" xmlns:w15="http://schemas.microsoft.com/office/word/2012/wordml" xmlns:w16cex="http://schemas.microsoft.com/office/word/2018/wordml/cex" xmlns:w16cid="http://schemas.microsoft.com/office/word/2016/wordml/cid" xmlns:w16="http://schemas.microsoft.com/office/word/2018/wordml" xmlns:w16du="http://schemas.microsoft.com/office/word/2023/wordml/word16du" xmlns:w16sdtdh="http://schemas.microsoft.com/office/word/2020/wordml/sdtdatahash" xmlns:w16sdtfl="http://schemas.microsoft.com/office/word/2024/wordml/sdtformatlock" xmlns:w16se="http://schemas.microsoft.com/office/word/2015/wordml/symex" xmlns:wpg="http://schemas.microsoft.com/office/word/2010/wordprocessingGroup" xmlns:wpi="http://schemas.microsoft.com/office/word/2010/wordprocessingInk" xmlns:wne="http://schemas.microsoft.com/office/word/2006/wordml" xmlns:wps="http://schemas.microsoft.com/office/word/2010/wordprocessingShape" mc:Ignorable="w14 w15 w16se w16cid w16 w16cex w16sdtdh w16sdtfl w16du wp14">
   <w:body>
     <w:sdt>
       <w:sdtPr>
@@ -557,7 +557,71 @@
                 <w:sz w:val="22"/>
                 <w:szCs w:val="22"/>
               </w:rPr>
-              <w:t>Overview Bradleys saloon, Goals, Timeline , Design and user experience , Technical requirements</w:t>
+              <w:t xml:space="preserve">Overview </w:t>
+            </w:r>
+            <w:proofErr w:type="spellStart"/>
+            <w:r>
+              <w:rPr>
+                <w:sz w:val="22"/>
+                <w:szCs w:val="22"/>
+              </w:rPr>
+              <w:t>Bradleys</w:t>
+            </w:r>
+            <w:proofErr w:type="spellEnd"/>
+            <w:r>
+              <w:rPr>
+                <w:sz w:val="22"/>
+                <w:szCs w:val="22"/>
+              </w:rPr>
+              <w:t xml:space="preserve"> saloon, Goals, </w:t>
+            </w:r>
+            <w:proofErr w:type="gramStart"/>
+            <w:r>
+              <w:rPr>
+                <w:sz w:val="22"/>
+                <w:szCs w:val="22"/>
+              </w:rPr>
+              <w:t>Timeline ,</w:t>
+            </w:r>
+            <w:proofErr w:type="gramEnd"/>
+            <w:r>
+              <w:rPr>
+                <w:sz w:val="22"/>
+                <w:szCs w:val="22"/>
+              </w:rPr>
+              <w:t xml:space="preserve"> Design and user </w:t>
+            </w:r>
+            <w:proofErr w:type="gramStart"/>
+            <w:r>
+              <w:rPr>
+                <w:sz w:val="22"/>
+                <w:szCs w:val="22"/>
+              </w:rPr>
+              <w:t>experience ,</w:t>
+            </w:r>
+            <w:proofErr w:type="gramEnd"/>
+            <w:r>
+              <w:rPr>
+                <w:sz w:val="22"/>
+                <w:szCs w:val="22"/>
+              </w:rPr>
+              <w:t xml:space="preserve"> </w:t>
+            </w:r>
+            <w:proofErr w:type="gramStart"/>
+            <w:r>
+              <w:rPr>
+                <w:sz w:val="22"/>
+                <w:szCs w:val="22"/>
+              </w:rPr>
+              <w:t>Technical</w:t>
+            </w:r>
+            <w:proofErr w:type="gramEnd"/>
+            <w:r>
+              <w:rPr>
+                <w:sz w:val="22"/>
+                <w:szCs w:val="22"/>
+              </w:rPr>
+              <w:t xml:space="preserve"> requirements</w:t>
             </w:r>
           </w:p>
         </w:tc>
@@ -683,7 +747,23 @@
                 <w:sz w:val="22"/>
                 <w:szCs w:val="22"/>
               </w:rPr>
-              <w:t>Overview SPCA , mission, goals,</w:t>
+              <w:t xml:space="preserve">Overview </w:t>
+            </w:r>
+            <w:proofErr w:type="gramStart"/>
+            <w:r>
+              <w:rPr>
+                <w:sz w:val="22"/>
+                <w:szCs w:val="22"/>
+              </w:rPr>
+              <w:t>SPCA ,</w:t>
+            </w:r>
+            <w:proofErr w:type="gramEnd"/>
+            <w:r>
+              <w:rPr>
+                <w:sz w:val="22"/>
+                <w:szCs w:val="22"/>
+              </w:rPr>
+              <w:t xml:space="preserve"> mission, goals,</w:t>
             </w:r>
           </w:p>
         </w:tc>
@@ -725,7 +805,39 @@
                 <w:sz w:val="22"/>
                 <w:szCs w:val="22"/>
               </w:rPr>
-              <w:t>Technical requirements , Timeline , Budget</w:t>
+              <w:t xml:space="preserve">Technical </w:t>
+            </w:r>
+            <w:proofErr w:type="gramStart"/>
+            <w:r>
+              <w:rPr>
+                <w:sz w:val="22"/>
+                <w:szCs w:val="22"/>
+              </w:rPr>
+              <w:t>requirements ,</w:t>
+            </w:r>
+            <w:proofErr w:type="gramEnd"/>
+            <w:r>
+              <w:rPr>
+                <w:sz w:val="22"/>
+                <w:szCs w:val="22"/>
+              </w:rPr>
+              <w:t xml:space="preserve"> </w:t>
+            </w:r>
+            <w:proofErr w:type="gramStart"/>
+            <w:r>
+              <w:rPr>
+                <w:sz w:val="22"/>
+                <w:szCs w:val="22"/>
+              </w:rPr>
+              <w:t>Timeline ,</w:t>
+            </w:r>
+            <w:proofErr w:type="gramEnd"/>
+            <w:r>
+              <w:rPr>
+                <w:sz w:val="22"/>
+                <w:szCs w:val="22"/>
+              </w:rPr>
+              <w:t xml:space="preserve"> Budget</w:t>
             </w:r>
           </w:p>
         </w:tc>
@@ -996,27 +1108,45 @@
           <w:szCs w:val="22"/>
         </w:rPr>
       </w:pPr>
-      <w:r>
-        <w:rPr>
-          <w:sz w:val="22"/>
-          <w:szCs w:val="22"/>
-        </w:rPr>
-        <w:t>Bradleys Unisex Salon</w:t>
-      </w:r>
-    </w:p>
-    <w:p>
-      <w:pPr>
-        <w:rPr>
-          <w:sz w:val="22"/>
-          <w:szCs w:val="22"/>
-        </w:rPr>
-      </w:pPr>
-      <w:r>
-        <w:rPr>
-          <w:sz w:val="22"/>
-          <w:szCs w:val="22"/>
-        </w:rPr>
-        <w:t>Bradleys Unisex Salon is a modern hair and beauty studio located in Pretoria, South Africa. Established in 2024, the salon was created to provide professional grooming services for both men and women in a comfortable, stylish environment. The business began as a small family venture and has grown into a trusted local brand known for its creativity, friendly service, and attention to detail.</w:t>
+      <w:proofErr w:type="spellStart"/>
+      <w:r>
+        <w:rPr>
+          <w:sz w:val="22"/>
+          <w:szCs w:val="22"/>
+        </w:rPr>
+        <w:t>Bradleys</w:t>
+      </w:r>
+      <w:proofErr w:type="spellEnd"/>
+      <w:r>
+        <w:rPr>
+          <w:sz w:val="22"/>
+          <w:szCs w:val="22"/>
+        </w:rPr>
+        <w:t xml:space="preserve"> Unisex Salon</w:t>
+      </w:r>
+    </w:p>
+    <w:p>
+      <w:pPr>
+        <w:rPr>
+          <w:sz w:val="22"/>
+          <w:szCs w:val="22"/>
+        </w:rPr>
+      </w:pPr>
+      <w:proofErr w:type="spellStart"/>
+      <w:r>
+        <w:rPr>
+          <w:sz w:val="22"/>
+          <w:szCs w:val="22"/>
+        </w:rPr>
+        <w:t>Bradleys</w:t>
+      </w:r>
+      <w:proofErr w:type="spellEnd"/>
+      <w:r>
+        <w:rPr>
+          <w:sz w:val="22"/>
+          <w:szCs w:val="22"/>
+        </w:rPr>
+        <w:t xml:space="preserve"> Unisex Salon is a modern hair and beauty studio located in Pretoria, South Africa. Established in 2024, the salon was created to provide professional grooming services for both men and women in a comfortable, stylish environment. The business began as a small family venture and has grown into a trusted local brand known for its creativity, friendly service, and attention to detail.</w:t>
       </w:r>
       <w:r>
         <w:rPr>
@@ -1030,22 +1160,54 @@
           <w:sz w:val="22"/>
           <w:szCs w:val="22"/>
         </w:rPr>
-        <w:t>The main goal of the Bradleys Unisex Salon website is to build a strong online presence and make it easier for clients to connect with the salon. The site will allow customers to book appointments online, view services, and learn more about the stylists. This makes the salon more accessible and convenient for both new and returning clients.</w:t>
-      </w:r>
-    </w:p>
-    <w:p>
-      <w:pPr>
-        <w:rPr>
-          <w:sz w:val="22"/>
-          <w:szCs w:val="22"/>
-        </w:rPr>
-      </w:pPr>
-      <w:r>
-        <w:rPr>
-          <w:sz w:val="22"/>
-          <w:szCs w:val="22"/>
-        </w:rPr>
-        <w:t>Another important goal is to showcase the creativity and professionalism of the salon. A gallery will display hairstyle transformations and styling inspiration, helping visitors see the quality of work. The website will also share beauty tips and product recommendations, positioning Bradleys as a trusted source for hair and beauty care.</w:t>
+        <w:t xml:space="preserve">The main goal of the </w:t>
+      </w:r>
+      <w:proofErr w:type="spellStart"/>
+      <w:r>
+        <w:rPr>
+          <w:sz w:val="22"/>
+          <w:szCs w:val="22"/>
+        </w:rPr>
+        <w:t>Bradleys</w:t>
+      </w:r>
+      <w:proofErr w:type="spellEnd"/>
+      <w:r>
+        <w:rPr>
+          <w:sz w:val="22"/>
+          <w:szCs w:val="22"/>
+        </w:rPr>
+        <w:t xml:space="preserve"> Unisex Salon website is to build a strong online presence and make it easier for clients to connect with the salon. The site will allow customers to book appointments online, view services, and learn more about the stylists. This makes the salon more accessible and convenient for both new and returning clients.</w:t>
+      </w:r>
+    </w:p>
+    <w:p>
+      <w:pPr>
+        <w:rPr>
+          <w:sz w:val="22"/>
+          <w:szCs w:val="22"/>
+        </w:rPr>
+      </w:pPr>
+      <w:r>
+        <w:rPr>
+          <w:sz w:val="22"/>
+          <w:szCs w:val="22"/>
+        </w:rPr>
+        <w:t xml:space="preserve">Another important goal is to showcase the creativity and professionalism of the salon. A gallery will display hairstyle transformations and styling inspiration, helping visitors see the quality of work. The website will also share beauty tips and product recommendations, positioning </w:t>
+      </w:r>
+      <w:proofErr w:type="spellStart"/>
+      <w:r>
+        <w:rPr>
+          <w:sz w:val="22"/>
+          <w:szCs w:val="22"/>
+        </w:rPr>
+        <w:t>Bradleys</w:t>
+      </w:r>
+      <w:proofErr w:type="spellEnd"/>
+      <w:r>
+        <w:rPr>
+          <w:sz w:val="22"/>
+          <w:szCs w:val="22"/>
+        </w:rPr>
+        <w:t xml:space="preserve"> as a trusted source for hair and beauty care.</w:t>
       </w:r>
     </w:p>
     <w:p>
@@ -1075,7 +1237,15 @@
           <w:sz w:val="22"/>
           <w:szCs w:val="22"/>
         </w:rPr>
-        <w:t>Design and User Experience</w:t>
+        <w:t xml:space="preserve">Design and User </w:t>
+      </w:r>
+      <w:proofErr w:type="gramStart"/>
+      <w:r>
+        <w:rPr>
+          <w:sz w:val="22"/>
+          <w:szCs w:val="22"/>
+        </w:rPr>
+        <w:t>Experience</w:t>
       </w:r>
       <w:r>
         <w:rPr>
@@ -1089,7 +1259,31 @@
           <w:sz w:val="22"/>
           <w:szCs w:val="22"/>
         </w:rPr>
-        <w:t>The website will have a clean, modern layout with a colour scheme of gold, black, and white to reflect elegance and professionalism. Fonts will be simple and easy to read, with stylish headings to match the salon’s branding. Navigation will be straightforward, ensuring users can easily find information about services, pricing, and contact details. The design will be mobile</w:t>
+        <w:t>The</w:t>
+      </w:r>
+      <w:proofErr w:type="gramEnd"/>
+      <w:r>
+        <w:rPr>
+          <w:sz w:val="22"/>
+          <w:szCs w:val="22"/>
+        </w:rPr>
+        <w:t xml:space="preserve"> website will have a clean, modern layout with a </w:t>
+      </w:r>
+      <w:proofErr w:type="spellStart"/>
+      <w:r>
+        <w:rPr>
+          <w:sz w:val="22"/>
+          <w:szCs w:val="22"/>
+        </w:rPr>
+        <w:t>colour</w:t>
+      </w:r>
+      <w:proofErr w:type="spellEnd"/>
+      <w:r>
+        <w:rPr>
+          <w:sz w:val="22"/>
+          <w:szCs w:val="22"/>
+        </w:rPr>
+        <w:t xml:space="preserve"> scheme of gold, black, and white to reflect elegance and professionalism. Fonts will be simple and easy to read, with stylish headings to match the salon’s branding. Navigation will be straightforward, ensuring users can easily find information about services, pricing, and contact details. The design will be mobile</w:t>
       </w:r>
       <w:r>
         <w:rPr>
@@ -1112,7 +1306,16 @@
           <w:sz w:val="22"/>
           <w:szCs w:val="22"/>
         </w:rPr>
-        <w:t>Technical Requirements</w:t>
+        <w:t xml:space="preserve">Technical </w:t>
+      </w:r>
+      <w:proofErr w:type="spellStart"/>
+      <w:proofErr w:type="gramStart"/>
+      <w:r>
+        <w:rPr>
+          <w:sz w:val="22"/>
+          <w:szCs w:val="22"/>
+        </w:rPr>
+        <w:t>Requirements</w:t>
       </w:r>
       <w:r>
         <w:rPr>
@@ -1126,7 +1329,16 @@
           <w:sz w:val="22"/>
           <w:szCs w:val="22"/>
         </w:rPr>
-        <w:t>The website will be built using HTML, CSS, and JavaScript, hosted on a secure server with an SSL certificate. The domain name will be www.bradleyssalon.co.za. Tools such as Visual Studio Code and GitHub will be used for development and version control.</w:t>
+        <w:t>The</w:t>
+      </w:r>
+      <w:proofErr w:type="spellEnd"/>
+      <w:proofErr w:type="gramEnd"/>
+      <w:r>
+        <w:rPr>
+          <w:sz w:val="22"/>
+          <w:szCs w:val="22"/>
+        </w:rPr>
+        <w:t xml:space="preserve"> website will be built using HTML, CSS, and JavaScript, hosted on a secure server with an SSL certificate. The domain name will be www.bradleyssalon.co.za. Tools such as Visual Studio Code and GitHub will be used for development and version control.</w:t>
       </w:r>
     </w:p>
     <w:p>
@@ -1151,10 +1363,10 @@
         <w:tblLook w:val="04A0" w:firstRow="1" w:lastRow="0" w:firstColumn="1" w:lastColumn="0" w:noHBand="0" w:noVBand="1"/>
       </w:tblPr>
       <w:tblGrid>
-        <w:gridCol w:w="2262"/>
-        <w:gridCol w:w="3756"/>
-        <w:gridCol w:w="1048"/>
-        <w:gridCol w:w="2284"/>
+        <w:gridCol w:w="2265"/>
+        <w:gridCol w:w="3760"/>
+        <w:gridCol w:w="1039"/>
+        <w:gridCol w:w="2286"/>
       </w:tblGrid>
       <w:tr>
         <w:tc>
@@ -1275,7 +1487,39 @@
                 <w:sz w:val="22"/>
                 <w:szCs w:val="22"/>
               </w:rPr>
-              <w:t>Research and planning :gather information, define goals, analyse competitors</w:t>
+              <w:t xml:space="preserve">Research and </w:t>
+            </w:r>
+            <w:proofErr w:type="gramStart"/>
+            <w:r>
+              <w:rPr>
+                <w:sz w:val="22"/>
+                <w:szCs w:val="22"/>
+              </w:rPr>
+              <w:t>planning :gather</w:t>
+            </w:r>
+            <w:proofErr w:type="gramEnd"/>
+            <w:r>
+              <w:rPr>
+                <w:sz w:val="22"/>
+                <w:szCs w:val="22"/>
+              </w:rPr>
+              <w:t xml:space="preserve"> information, define goals, </w:t>
+            </w:r>
+            <w:proofErr w:type="spellStart"/>
+            <w:r>
+              <w:rPr>
+                <w:sz w:val="22"/>
+                <w:szCs w:val="22"/>
+              </w:rPr>
+              <w:t>analyse</w:t>
+            </w:r>
+            <w:proofErr w:type="spellEnd"/>
+            <w:r>
+              <w:rPr>
+                <w:sz w:val="22"/>
+                <w:szCs w:val="22"/>
+              </w:rPr>
+              <w:t xml:space="preserve"> competitors</w:t>
             </w:r>
           </w:p>
         </w:tc>
@@ -1357,7 +1601,23 @@
                 <w:sz w:val="22"/>
                 <w:szCs w:val="22"/>
               </w:rPr>
-              <w:t>Design wireframes and layout :create sketches of homepage, services, and contact flow</w:t>
+              <w:t xml:space="preserve">Design wireframes and </w:t>
+            </w:r>
+            <w:proofErr w:type="gramStart"/>
+            <w:r>
+              <w:rPr>
+                <w:sz w:val="22"/>
+                <w:szCs w:val="22"/>
+              </w:rPr>
+              <w:t>layout :create</w:t>
+            </w:r>
+            <w:proofErr w:type="gramEnd"/>
+            <w:r>
+              <w:rPr>
+                <w:sz w:val="22"/>
+                <w:szCs w:val="22"/>
+              </w:rPr>
+              <w:t xml:space="preserve"> sketches of homepage, services, and contact flow</w:t>
             </w:r>
           </w:p>
         </w:tc>
@@ -1419,6 +1679,7 @@
                 <w:sz w:val="22"/>
                 <w:szCs w:val="22"/>
               </w:rPr>
+              <w:lastRenderedPageBreak/>
               <w:t>Week3-4</w:t>
             </w:r>
           </w:p>
@@ -1439,7 +1700,23 @@
                 <w:sz w:val="22"/>
                 <w:szCs w:val="22"/>
               </w:rPr>
-              <w:t>Develop HTML/CSS structure :build pages: Home, About, Services, Enquiry, Contact</w:t>
+              <w:t xml:space="preserve">Develop HTML/CSS </w:t>
+            </w:r>
+            <w:proofErr w:type="gramStart"/>
+            <w:r>
+              <w:rPr>
+                <w:sz w:val="22"/>
+                <w:szCs w:val="22"/>
+              </w:rPr>
+              <w:t>structure :build</w:t>
+            </w:r>
+            <w:proofErr w:type="gramEnd"/>
+            <w:r>
+              <w:rPr>
+                <w:sz w:val="22"/>
+                <w:szCs w:val="22"/>
+              </w:rPr>
+              <w:t xml:space="preserve"> pages: Home, About, Services, Enquiry, Contact</w:t>
             </w:r>
           </w:p>
         </w:tc>
@@ -1501,7 +1778,6 @@
                 <w:sz w:val="22"/>
                 <w:szCs w:val="22"/>
               </w:rPr>
-              <w:lastRenderedPageBreak/>
               <w:t>Week5</w:t>
             </w:r>
           </w:p>
@@ -1522,7 +1798,23 @@
                 <w:sz w:val="22"/>
                 <w:szCs w:val="22"/>
               </w:rPr>
-              <w:t>Add JavaScript functionality :form validation, interactive menus, booking system</w:t>
+              <w:t xml:space="preserve">Add JavaScript </w:t>
+            </w:r>
+            <w:proofErr w:type="gramStart"/>
+            <w:r>
+              <w:rPr>
+                <w:sz w:val="22"/>
+                <w:szCs w:val="22"/>
+              </w:rPr>
+              <w:t>functionality :form</w:t>
+            </w:r>
+            <w:proofErr w:type="gramEnd"/>
+            <w:r>
+              <w:rPr>
+                <w:sz w:val="22"/>
+                <w:szCs w:val="22"/>
+              </w:rPr>
+              <w:t xml:space="preserve"> validation, interactive menus, booking system</w:t>
             </w:r>
           </w:p>
         </w:tc>
@@ -1604,7 +1896,23 @@
                 <w:sz w:val="22"/>
                 <w:szCs w:val="22"/>
               </w:rPr>
-              <w:t>Testing and debugging :check responsiveness, browser compatibility, fix errors</w:t>
+              <w:t xml:space="preserve">Testing and </w:t>
+            </w:r>
+            <w:proofErr w:type="gramStart"/>
+            <w:r>
+              <w:rPr>
+                <w:sz w:val="22"/>
+                <w:szCs w:val="22"/>
+              </w:rPr>
+              <w:t>debugging :check</w:t>
+            </w:r>
+            <w:proofErr w:type="gramEnd"/>
+            <w:r>
+              <w:rPr>
+                <w:sz w:val="22"/>
+                <w:szCs w:val="22"/>
+              </w:rPr>
+              <w:t xml:space="preserve"> responsiveness, browser compatibility, fix errors</w:t>
             </w:r>
           </w:p>
         </w:tc>
@@ -1646,7 +1954,7 @@
             </w:tblPr>
             <w:tblGrid>
               <w:gridCol w:w="81"/>
-              <w:gridCol w:w="1987"/>
+              <w:gridCol w:w="1989"/>
             </w:tblGrid>
             <w:tr>
               <w:trPr>
@@ -1750,7 +2058,23 @@
                 <w:sz w:val="22"/>
                 <w:szCs w:val="22"/>
               </w:rPr>
-              <w:t>Final review and submission :polish design, update README, upload to GitHub</w:t>
+              <w:t xml:space="preserve">Final review and </w:t>
+            </w:r>
+            <w:proofErr w:type="gramStart"/>
+            <w:r>
+              <w:rPr>
+                <w:sz w:val="22"/>
+                <w:szCs w:val="22"/>
+              </w:rPr>
+              <w:t>submission :polish</w:t>
+            </w:r>
+            <w:proofErr w:type="gramEnd"/>
+            <w:r>
+              <w:rPr>
+                <w:sz w:val="22"/>
+                <w:szCs w:val="22"/>
+              </w:rPr>
+              <w:t xml:space="preserve"> design, update README, upload to GitHub</w:t>
             </w:r>
           </w:p>
         </w:tc>
@@ -2429,6 +2753,7 @@
                 <w:sz w:val="22"/>
                 <w:szCs w:val="22"/>
               </w:rPr>
+              <w:lastRenderedPageBreak/>
               <w:t>Marketing Integration</w:t>
             </w:r>
           </w:p>
@@ -2449,7 +2774,23 @@
                 <w:sz w:val="22"/>
                 <w:szCs w:val="22"/>
               </w:rPr>
-              <w:t>Linking social media, SEO optimisation, and promotional banners</w:t>
+              <w:t xml:space="preserve">Linking social media, SEO </w:t>
+            </w:r>
+            <w:proofErr w:type="spellStart"/>
+            <w:r>
+              <w:rPr>
+                <w:sz w:val="22"/>
+                <w:szCs w:val="22"/>
+              </w:rPr>
+              <w:t>optimisation</w:t>
+            </w:r>
+            <w:proofErr w:type="spellEnd"/>
+            <w:r>
+              <w:rPr>
+                <w:sz w:val="22"/>
+                <w:szCs w:val="22"/>
+              </w:rPr>
+              <w:t>, and promotional banners</w:t>
             </w:r>
           </w:p>
         </w:tc>
@@ -2550,7 +2891,6 @@
           <w:sz w:val="22"/>
           <w:szCs w:val="22"/>
         </w:rPr>
-        <w:lastRenderedPageBreak/>
         <w:t>References</w:t>
       </w:r>
     </w:p>
@@ -2566,7 +2906,23 @@
           <w:sz w:val="22"/>
           <w:szCs w:val="22"/>
         </w:rPr>
-        <w:t xml:space="preserve">  Bradleys Unisex Salon. (n.d.). </w:t>
+        <w:t xml:space="preserve">  </w:t>
+      </w:r>
+      <w:proofErr w:type="spellStart"/>
+      <w:r>
+        <w:rPr>
+          <w:sz w:val="22"/>
+          <w:szCs w:val="22"/>
+        </w:rPr>
+        <w:t>Bradleys</w:t>
+      </w:r>
+      <w:proofErr w:type="spellEnd"/>
+      <w:r>
+        <w:rPr>
+          <w:sz w:val="22"/>
+          <w:szCs w:val="22"/>
+        </w:rPr>
+        <w:t xml:space="preserve"> Unisex Salon. (n.d.). </w:t>
       </w:r>
       <w:r>
         <w:rPr>
@@ -2659,7 +3015,23 @@
           <w:sz w:val="22"/>
           <w:szCs w:val="22"/>
         </w:rPr>
-        <w:t xml:space="preserve"> Unsplash. (n.d.). </w:t>
+        <w:t xml:space="preserve"> </w:t>
+      </w:r>
+      <w:proofErr w:type="spellStart"/>
+      <w:r>
+        <w:rPr>
+          <w:sz w:val="22"/>
+          <w:szCs w:val="22"/>
+        </w:rPr>
+        <w:t>Unsplash</w:t>
+      </w:r>
+      <w:proofErr w:type="spellEnd"/>
+      <w:r>
+        <w:rPr>
+          <w:sz w:val="22"/>
+          <w:szCs w:val="22"/>
+        </w:rPr>
+        <w:t xml:space="preserve">. (n.d.). </w:t>
       </w:r>
       <w:r>
         <w:rPr>
@@ -2966,6 +3338,7 @@
           <w:szCs w:val="22"/>
         </w:rPr>
       </w:pPr>
+      <w:proofErr w:type="spellStart"/>
       <w:r>
         <w:rPr>
           <w:b/>
@@ -2973,8 +3346,17 @@
           <w:sz w:val="22"/>
           <w:szCs w:val="22"/>
         </w:rPr>
-        <w:lastRenderedPageBreak/>
-        <w:t>Organisation Overview</w:t>
+        <w:t>Organisation</w:t>
+      </w:r>
+      <w:proofErr w:type="spellEnd"/>
+      <w:r>
+        <w:rPr>
+          <w:b/>
+          <w:bCs/>
+          <w:sz w:val="22"/>
+          <w:szCs w:val="22"/>
+        </w:rPr>
+        <w:t xml:space="preserve"> Overview</w:t>
       </w:r>
     </w:p>
     <w:p>
@@ -2997,7 +3379,39 @@
           <w:szCs w:val="22"/>
         </w:rPr>
         <w:noBreakHyphen/>
-        <w:t>profit organisation committed to protecting animals from cruelty, neglect, and abuse. Established in 1950, it has served the Pretoria community for decades by rescuing, rehabilitating, and rehoming animals. The organisation also promotes responsible pet ownership through education and outreach.</w:t>
+        <w:t xml:space="preserve">profit </w:t>
+      </w:r>
+      <w:proofErr w:type="spellStart"/>
+      <w:r>
+        <w:rPr>
+          <w:sz w:val="22"/>
+          <w:szCs w:val="22"/>
+        </w:rPr>
+        <w:t>organisation</w:t>
+      </w:r>
+      <w:proofErr w:type="spellEnd"/>
+      <w:r>
+        <w:rPr>
+          <w:sz w:val="22"/>
+          <w:szCs w:val="22"/>
+        </w:rPr>
+        <w:t xml:space="preserve"> committed to protecting animals from cruelty, neglect, and abuse. Established in 1950, it has served the Pretoria community for decades by rescuing, rehabilitating, and rehoming animals. The </w:t>
+      </w:r>
+      <w:proofErr w:type="spellStart"/>
+      <w:r>
+        <w:rPr>
+          <w:sz w:val="22"/>
+          <w:szCs w:val="22"/>
+        </w:rPr>
+        <w:t>organisation</w:t>
+      </w:r>
+      <w:proofErr w:type="spellEnd"/>
+      <w:r>
+        <w:rPr>
+          <w:sz w:val="22"/>
+          <w:szCs w:val="22"/>
+        </w:rPr>
+        <w:t xml:space="preserve"> also promotes responsible pet ownership through education and outreach.</w:t>
       </w:r>
     </w:p>
     <w:p>
@@ -3315,7 +3729,23 @@
           <w:sz w:val="22"/>
           <w:szCs w:val="22"/>
         </w:rPr>
-        <w:t>The website will use a clean, compassionate design with a colour scheme of green, white, and soft brown to reflect nature and care. Fonts will be simple and easy to read, while navigation will be straightforward. The site will be mobile</w:t>
+        <w:t xml:space="preserve">The website will use a clean, compassionate design with a </w:t>
+      </w:r>
+      <w:proofErr w:type="spellStart"/>
+      <w:r>
+        <w:rPr>
+          <w:sz w:val="22"/>
+          <w:szCs w:val="22"/>
+        </w:rPr>
+        <w:t>colour</w:t>
+      </w:r>
+      <w:proofErr w:type="spellEnd"/>
+      <w:r>
+        <w:rPr>
+          <w:sz w:val="22"/>
+          <w:szCs w:val="22"/>
+        </w:rPr>
+        <w:t xml:space="preserve"> scheme of green, white, and soft brown to reflect nature and care. Fonts will be simple and easy to read, while navigation will be straightforward. The site will be mobile</w:t>
       </w:r>
       <w:r>
         <w:rPr>
@@ -3331,7 +3761,15 @@
           <w:szCs w:val="22"/>
         </w:rPr>
         <w:noBreakHyphen/>
-        <w:t>loading, and accessible to all users. A gallery of adoptable animals will be the highlight, supported by clear calls to action for donations and volunteering.</w:t>
+        <w:t xml:space="preserve">loading, and accessible to all users. A gallery </w:t>
+      </w:r>
+      <w:r>
+        <w:rPr>
+          <w:sz w:val="22"/>
+          <w:szCs w:val="22"/>
+        </w:rPr>
+        <w:lastRenderedPageBreak/>
+        <w:t>of adoptable animals will be the highlight, supported by clear calls to action for donations and volunteering.</w:t>
       </w:r>
     </w:p>
     <w:p>
@@ -3400,7 +3838,6 @@
           <w:sz w:val="22"/>
           <w:szCs w:val="22"/>
         </w:rPr>
-        <w:lastRenderedPageBreak/>
         <w:t>Timeline and Budget</w:t>
       </w:r>
     </w:p>
@@ -3436,10 +3873,10 @@
               <w:tblLook w:val="04A0" w:firstRow="1" w:lastRow="0" w:firstColumn="1" w:lastColumn="0" w:noHBand="0" w:noVBand="1"/>
             </w:tblPr>
             <w:tblGrid>
-              <w:gridCol w:w="910"/>
-              <w:gridCol w:w="2821"/>
-              <w:gridCol w:w="1121"/>
-              <w:gridCol w:w="2205"/>
+              <w:gridCol w:w="896"/>
+              <w:gridCol w:w="2853"/>
+              <w:gridCol w:w="1085"/>
+              <w:gridCol w:w="2223"/>
             </w:tblGrid>
             <w:tr>
               <w:tc>
@@ -4441,6 +4878,7 @@
           <w:sz w:val="22"/>
           <w:szCs w:val="22"/>
         </w:rPr>
+        <w:lastRenderedPageBreak/>
         <w:t>References</w:t>
       </w:r>
     </w:p>
@@ -4580,7 +5018,6 @@
           <w:sz w:val="22"/>
           <w:szCs w:val="22"/>
         </w:rPr>
-        <w:lastRenderedPageBreak/>
         <w:t xml:space="preserve">  W3Schools. (n.d.). </w:t>
       </w:r>
       <w:r>
@@ -4754,6 +5191,7 @@
           <w:t>https://developer.mozilla.org</w:t>
         </w:r>
       </w:hyperlink>
+      <w:proofErr w:type="gramStart"/>
       <w:r>
         <w:rPr>
           <w:sz w:val="22"/>
@@ -4766,22 +5204,46 @@
           <w:sz w:val="22"/>
           <w:szCs w:val="22"/>
         </w:rPr>
-        <w:t xml:space="preserve"> [Accessed 14 August 2026].</w:t>
-      </w:r>
-    </w:p>
-    <w:p>
-      <w:pPr>
-        <w:rPr>
-          <w:sz w:val="22"/>
-          <w:szCs w:val="22"/>
-        </w:rPr>
-      </w:pPr>
-      <w:r>
-        <w:rPr>
-          <w:sz w:val="22"/>
-          <w:szCs w:val="22"/>
-        </w:rPr>
-        <w:t xml:space="preserve">  Unsplash. (n.d.). </w:t>
+        <w:t xml:space="preserve"> [</w:t>
+      </w:r>
+      <w:proofErr w:type="gramEnd"/>
+      <w:r>
+        <w:rPr>
+          <w:sz w:val="22"/>
+          <w:szCs w:val="22"/>
+        </w:rPr>
+        <w:t>Accessed 14 August 2026].</w:t>
+      </w:r>
+    </w:p>
+    <w:p>
+      <w:pPr>
+        <w:rPr>
+          <w:sz w:val="22"/>
+          <w:szCs w:val="22"/>
+        </w:rPr>
+      </w:pPr>
+      <w:r>
+        <w:rPr>
+          <w:sz w:val="22"/>
+          <w:szCs w:val="22"/>
+        </w:rPr>
+        <w:t xml:space="preserve">  </w:t>
+      </w:r>
+      <w:proofErr w:type="spellStart"/>
+      <w:r>
+        <w:rPr>
+          <w:sz w:val="22"/>
+          <w:szCs w:val="22"/>
+        </w:rPr>
+        <w:t>Unsplash</w:t>
+      </w:r>
+      <w:proofErr w:type="spellEnd"/>
+      <w:r>
+        <w:rPr>
+          <w:sz w:val="22"/>
+          <w:szCs w:val="22"/>
+        </w:rPr>
+        <w:t xml:space="preserve">. (n.d.). </w:t>
       </w:r>
       <w:r>
         <w:rPr>
@@ -4860,7 +5322,23 @@
           <w:sz w:val="22"/>
           <w:szCs w:val="22"/>
         </w:rPr>
-        <w:t xml:space="preserve">  Pexels. (n.d.). </w:t>
+        <w:t xml:space="preserve">  </w:t>
+      </w:r>
+      <w:proofErr w:type="spellStart"/>
+      <w:r>
+        <w:rPr>
+          <w:sz w:val="22"/>
+          <w:szCs w:val="22"/>
+        </w:rPr>
+        <w:t>Pexels</w:t>
+      </w:r>
+      <w:proofErr w:type="spellEnd"/>
+      <w:r>
+        <w:rPr>
+          <w:sz w:val="22"/>
+          <w:szCs w:val="22"/>
+        </w:rPr>
+        <w:t xml:space="preserve">. (n.d.). </w:t>
       </w:r>
       <w:r>
         <w:rPr>
@@ -5074,2987 +5552,14 @@
     </w:p>
     <w:p>
       <w:pPr>
-        <w:pStyle w:val="NormalWeb"/>
-        <w:rPr>
-          <w:rStyle w:val="Strong"/>
-          <w:rFonts w:eastAsiaTheme="majorEastAsia"/>
-        </w:rPr>
-      </w:pPr>
-    </w:p>
-    <w:p>
-      <w:pPr>
-        <w:pStyle w:val="NormalWeb"/>
-      </w:pPr>
-      <w:r>
-        <w:rPr>
-          <w:rStyle w:val="Strong"/>
-          <w:rFonts w:eastAsiaTheme="majorEastAsia"/>
-        </w:rPr>
-        <w:t>Hosting and Domain</w:t>
-      </w:r>
-    </w:p>
-    <w:p>
-      <w:pPr>
-        <w:pStyle w:val="NormalWeb"/>
-        <w:numPr>
-          <w:ilvl w:val="0"/>
-          <w:numId w:val="15"/>
-        </w:numPr>
-      </w:pPr>
-      <w:r>
-        <w:t>Website hosted on a reliable platform (e.g., Hostinger, GoDaddy, or GitHub Pages).</w:t>
-      </w:r>
-    </w:p>
-    <w:p>
-      <w:pPr>
-        <w:pStyle w:val="NormalWeb"/>
-        <w:numPr>
-          <w:ilvl w:val="0"/>
-          <w:numId w:val="15"/>
-        </w:numPr>
-      </w:pPr>
-      <w:r>
-        <w:t xml:space="preserve">Domain name: </w:t>
-      </w:r>
-      <w:r>
-        <w:rPr>
-          <w:rStyle w:val="HTMLCode"/>
-          <w:rFonts w:eastAsiaTheme="majorEastAsia"/>
-        </w:rPr>
-        <w:t>www.bradleysunisexsalon.co.za</w:t>
-      </w:r>
-      <w:r>
-        <w:t>.</w:t>
-      </w:r>
-    </w:p>
-    <w:p>
-      <w:pPr>
-        <w:pStyle w:val="NormalWeb"/>
-        <w:numPr>
-          <w:ilvl w:val="0"/>
-          <w:numId w:val="15"/>
-        </w:numPr>
-      </w:pPr>
-      <w:r>
-        <w:t>SSL certificate included for secure HTTPS access.</w:t>
-      </w:r>
-    </w:p>
-    <w:p>
-      <w:pPr>
-        <w:pStyle w:val="NormalWeb"/>
-      </w:pPr>
-      <w:r>
-        <w:rPr>
-          <w:rStyle w:val="Strong"/>
-          <w:rFonts w:eastAsiaTheme="majorEastAsia"/>
-        </w:rPr>
-        <w:t>Development Tools</w:t>
-      </w:r>
-    </w:p>
-    <w:p>
-      <w:pPr>
-        <w:pStyle w:val="NormalWeb"/>
-        <w:numPr>
-          <w:ilvl w:val="0"/>
-          <w:numId w:val="16"/>
-        </w:numPr>
-      </w:pPr>
-      <w:r>
-        <w:t>Visual Studio Code for editing HTML, CSS, and JavaScript.</w:t>
-      </w:r>
-    </w:p>
-    <w:p>
-      <w:pPr>
-        <w:pStyle w:val="NormalWeb"/>
-        <w:numPr>
-          <w:ilvl w:val="0"/>
-          <w:numId w:val="16"/>
-        </w:numPr>
-      </w:pPr>
-      <w:r>
-        <w:t>Git and GitHub for version control and collaboration.</w:t>
-      </w:r>
-    </w:p>
-    <w:p>
-      <w:pPr>
-        <w:pStyle w:val="NormalWeb"/>
-        <w:numPr>
-          <w:ilvl w:val="0"/>
-          <w:numId w:val="16"/>
-        </w:numPr>
-      </w:pPr>
-      <w:r>
-        <w:t>Browser Developer Tools (Chrome DevTools) for debugging and responsiveness testing.</w:t>
-      </w:r>
-    </w:p>
-    <w:p>
-      <w:pPr>
-        <w:pStyle w:val="NormalWeb"/>
-      </w:pPr>
-      <w:r>
-        <w:rPr>
-          <w:rStyle w:val="Strong"/>
-          <w:rFonts w:eastAsiaTheme="majorEastAsia"/>
-        </w:rPr>
-        <w:t>Languages and Frameworks</w:t>
-      </w:r>
-    </w:p>
-    <w:p>
-      <w:pPr>
-        <w:pStyle w:val="NormalWeb"/>
-        <w:numPr>
-          <w:ilvl w:val="0"/>
-          <w:numId w:val="17"/>
-        </w:numPr>
-      </w:pPr>
-      <w:r>
-        <w:t>HTML5 for semantic structure.</w:t>
-      </w:r>
-    </w:p>
-    <w:p>
-      <w:pPr>
-        <w:pStyle w:val="NormalWeb"/>
-        <w:numPr>
-          <w:ilvl w:val="0"/>
-          <w:numId w:val="17"/>
-        </w:numPr>
-      </w:pPr>
-      <w:r>
-        <w:t>CSS3 for styling and responsive layouts.</w:t>
-      </w:r>
-    </w:p>
-    <w:p>
-      <w:pPr>
-        <w:pStyle w:val="NormalWeb"/>
-        <w:numPr>
-          <w:ilvl w:val="0"/>
-          <w:numId w:val="17"/>
-        </w:numPr>
-      </w:pPr>
-      <w:r>
-        <w:t>JavaScript for interactivity (form validation, booking button functionality).</w:t>
-      </w:r>
-    </w:p>
-    <w:p>
-      <w:pPr>
-        <w:pStyle w:val="NormalWeb"/>
-        <w:numPr>
-          <w:ilvl w:val="0"/>
-          <w:numId w:val="17"/>
-        </w:numPr>
-      </w:pPr>
-      <w:r>
-        <w:t>Optional: Bootstrap or CSS Grid/Flexbox for advanced layout control.</w:t>
-      </w:r>
-    </w:p>
-    <w:p>
-      <w:pPr>
-        <w:pStyle w:val="NormalWeb"/>
-      </w:pPr>
-      <w:r>
-        <w:rPr>
-          <w:rStyle w:val="Strong"/>
-          <w:rFonts w:eastAsiaTheme="majorEastAsia"/>
-        </w:rPr>
-        <w:t>Responsive Design</w:t>
-      </w:r>
-    </w:p>
-    <w:p>
-      <w:pPr>
-        <w:pStyle w:val="NormalWeb"/>
-        <w:numPr>
-          <w:ilvl w:val="0"/>
-          <w:numId w:val="18"/>
-        </w:numPr>
-      </w:pPr>
-      <w:r>
-        <w:t>Media queries for desktop, tablet, and mobile breakpoints.</w:t>
-      </w:r>
-    </w:p>
-    <w:p>
-      <w:pPr>
-        <w:pStyle w:val="NormalWeb"/>
-        <w:numPr>
-          <w:ilvl w:val="0"/>
-          <w:numId w:val="18"/>
-        </w:numPr>
-      </w:pPr>
-      <w:r>
-        <w:t>Layout adapts from multi</w:t>
-      </w:r>
-      <w:r>
-        <w:noBreakHyphen/>
-        <w:t>column (desktop) to single</w:t>
-      </w:r>
-      <w:r>
-        <w:noBreakHyphen/>
-        <w:t>column (mobile).</w:t>
-      </w:r>
-    </w:p>
-    <w:p>
-      <w:pPr>
-        <w:pStyle w:val="NormalWeb"/>
-        <w:numPr>
-          <w:ilvl w:val="0"/>
-          <w:numId w:val="18"/>
-        </w:numPr>
-      </w:pPr>
-      <w:r>
-        <w:t>Relative units (</w:t>
-      </w:r>
-      <w:r>
-        <w:rPr>
-          <w:rStyle w:val="HTMLCode"/>
-          <w:rFonts w:eastAsiaTheme="majorEastAsia"/>
-        </w:rPr>
-        <w:t>em</w:t>
-      </w:r>
-      <w:r>
-        <w:t xml:space="preserve">, </w:t>
-      </w:r>
-      <w:r>
-        <w:rPr>
-          <w:rStyle w:val="HTMLCode"/>
-          <w:rFonts w:eastAsiaTheme="majorEastAsia"/>
-        </w:rPr>
-        <w:t>rem</w:t>
-      </w:r>
-      <w:r>
-        <w:t xml:space="preserve">, </w:t>
-      </w:r>
-      <w:r>
-        <w:rPr>
-          <w:rStyle w:val="HTMLCode"/>
-          <w:rFonts w:eastAsiaTheme="majorEastAsia"/>
-        </w:rPr>
-        <w:t>%</w:t>
-      </w:r>
-      <w:r>
-        <w:t>) for scalable text and spacing.</w:t>
-      </w:r>
-    </w:p>
-    <w:p>
-      <w:pPr>
-        <w:pStyle w:val="NormalWeb"/>
-      </w:pPr>
-      <w:r>
-        <w:rPr>
-          <w:rStyle w:val="Strong"/>
-          <w:rFonts w:eastAsiaTheme="majorEastAsia"/>
-        </w:rPr>
-        <w:t>Performance and Optimization</w:t>
-      </w:r>
-    </w:p>
-    <w:p>
-      <w:pPr>
-        <w:pStyle w:val="NormalWeb"/>
-        <w:numPr>
-          <w:ilvl w:val="0"/>
-          <w:numId w:val="19"/>
-        </w:numPr>
-      </w:pPr>
-      <w:r>
-        <w:t>Compressed images (JPEG/WebP) for faster loading.</w:t>
-      </w:r>
-    </w:p>
-    <w:p>
-      <w:pPr>
-        <w:pStyle w:val="NormalWeb"/>
-        <w:numPr>
-          <w:ilvl w:val="0"/>
-          <w:numId w:val="19"/>
-        </w:numPr>
-      </w:pPr>
-      <w:r>
-        <w:t>Minified CSS and JS files to reduce file size.</w:t>
-      </w:r>
-    </w:p>
-    <w:p>
-      <w:pPr>
-        <w:pStyle w:val="NormalWeb"/>
-        <w:numPr>
-          <w:ilvl w:val="0"/>
-          <w:numId w:val="19"/>
-        </w:numPr>
-      </w:pPr>
-      <w:r>
-        <w:t>Lazy loading for below</w:t>
-      </w:r>
-      <w:r>
-        <w:noBreakHyphen/>
-        <w:t>the</w:t>
-      </w:r>
-      <w:r>
-        <w:noBreakHyphen/>
-        <w:t>fold images.</w:t>
-      </w:r>
-    </w:p>
-    <w:p>
-      <w:pPr>
-        <w:pStyle w:val="NormalWeb"/>
-        <w:numPr>
-          <w:ilvl w:val="0"/>
-          <w:numId w:val="19"/>
-        </w:numPr>
-      </w:pPr>
-      <w:r>
-        <w:t>Browser caching enabled for repeat visitors.</w:t>
-      </w:r>
-    </w:p>
-    <w:p>
-      <w:pPr>
-        <w:pStyle w:val="NormalWeb"/>
-      </w:pPr>
-      <w:r>
-        <w:rPr>
-          <w:rStyle w:val="Strong"/>
-          <w:rFonts w:eastAsiaTheme="majorEastAsia"/>
-        </w:rPr>
-        <w:t>Accessibility</w:t>
-      </w:r>
-    </w:p>
-    <w:p>
-      <w:pPr>
-        <w:pStyle w:val="NormalWeb"/>
-        <w:numPr>
-          <w:ilvl w:val="0"/>
-          <w:numId w:val="20"/>
-        </w:numPr>
-      </w:pPr>
-      <w:r>
-        <w:t>Semantic HTML tags for screen readers.</w:t>
-      </w:r>
-    </w:p>
-    <w:p>
-      <w:pPr>
-        <w:pStyle w:val="NormalWeb"/>
-        <w:numPr>
-          <w:ilvl w:val="0"/>
-          <w:numId w:val="20"/>
-        </w:numPr>
-      </w:pPr>
-      <w:r>
-        <w:t>Alt text for all images.</w:t>
-      </w:r>
-    </w:p>
-    <w:p>
-      <w:pPr>
-        <w:pStyle w:val="NormalWeb"/>
-        <w:numPr>
-          <w:ilvl w:val="0"/>
-          <w:numId w:val="20"/>
-        </w:numPr>
-      </w:pPr>
-      <w:r>
-        <w:t>High</w:t>
-      </w:r>
-      <w:r>
-        <w:noBreakHyphen/>
-        <w:t>contrast color scheme for readability.</w:t>
-      </w:r>
-    </w:p>
-    <w:p>
-      <w:pPr>
-        <w:pStyle w:val="NormalWeb"/>
-        <w:numPr>
-          <w:ilvl w:val="0"/>
-          <w:numId w:val="20"/>
-        </w:numPr>
-      </w:pPr>
-      <w:r>
-        <w:t>Keyboard</w:t>
-      </w:r>
-      <w:r>
-        <w:noBreakHyphen/>
-        <w:t>friendly navigation.</w:t>
-      </w:r>
-    </w:p>
-    <w:p>
-      <w:pPr>
-        <w:pStyle w:val="NormalWeb"/>
-      </w:pPr>
-      <w:r>
-        <w:rPr>
-          <w:rStyle w:val="Strong"/>
-          <w:rFonts w:eastAsiaTheme="majorEastAsia"/>
-        </w:rPr>
-        <w:t>Security</w:t>
-      </w:r>
-    </w:p>
-    <w:p>
-      <w:pPr>
-        <w:pStyle w:val="NormalWeb"/>
-        <w:numPr>
-          <w:ilvl w:val="0"/>
-          <w:numId w:val="21"/>
-        </w:numPr>
-      </w:pPr>
-      <w:r>
-        <w:t>SSL encryption for secure data transfer.</w:t>
-      </w:r>
-    </w:p>
-    <w:p>
-      <w:pPr>
-        <w:pStyle w:val="NormalWeb"/>
-        <w:numPr>
-          <w:ilvl w:val="0"/>
-          <w:numId w:val="21"/>
-        </w:numPr>
-      </w:pPr>
-      <w:r>
-        <w:t>Form validation to prevent spam or malicious input.</w:t>
-      </w:r>
-    </w:p>
-    <w:p>
-      <w:pPr>
-        <w:pStyle w:val="NormalWeb"/>
-        <w:numPr>
-          <w:ilvl w:val="0"/>
-          <w:numId w:val="21"/>
-        </w:numPr>
-      </w:pPr>
-      <w:r>
-        <w:t>Regular backups of website files and database.</w:t>
-      </w:r>
-    </w:p>
-    <w:p>
-      <w:pPr>
-        <w:pStyle w:val="NormalWeb"/>
-      </w:pPr>
-      <w:r>
-        <w:rPr>
-          <w:rStyle w:val="Strong"/>
-          <w:rFonts w:eastAsiaTheme="majorEastAsia"/>
-        </w:rPr>
-        <w:lastRenderedPageBreak/>
-        <w:t>Maintenance</w:t>
-      </w:r>
-    </w:p>
-    <w:p>
-      <w:pPr>
-        <w:pStyle w:val="NormalWeb"/>
-        <w:numPr>
-          <w:ilvl w:val="0"/>
-          <w:numId w:val="22"/>
-        </w:numPr>
-      </w:pPr>
-      <w:r>
-        <w:t>Monthly updates for content and images.</w:t>
-      </w:r>
-    </w:p>
-    <w:p>
-      <w:pPr>
-        <w:pStyle w:val="NormalWeb"/>
-        <w:numPr>
-          <w:ilvl w:val="0"/>
-          <w:numId w:val="22"/>
-        </w:numPr>
-      </w:pPr>
-      <w:r>
-        <w:t>Regular checks for broken links or outdated information.</w:t>
-      </w:r>
-    </w:p>
-    <w:p>
-      <w:pPr>
-        <w:pStyle w:val="NormalWeb"/>
-        <w:numPr>
-          <w:ilvl w:val="0"/>
-          <w:numId w:val="22"/>
-        </w:numPr>
-      </w:pPr>
-      <w:r>
-        <w:t>GitHub changelog entries documenting all edits.</w:t>
-      </w:r>
-    </w:p>
-    <w:p>
-      <w:pPr>
-        <w:pStyle w:val="NormalWeb"/>
-      </w:pPr>
-      <w:r>
-        <w:rPr>
-          <w:rStyle w:val="Strong"/>
-          <w:rFonts w:eastAsiaTheme="majorEastAsia"/>
-        </w:rPr>
-        <w:t>Integration</w:t>
-      </w:r>
-    </w:p>
-    <w:p>
-      <w:pPr>
-        <w:pStyle w:val="NormalWeb"/>
-        <w:numPr>
-          <w:ilvl w:val="0"/>
-          <w:numId w:val="23"/>
-        </w:numPr>
-      </w:pPr>
-      <w:r>
-        <w:t>Embedded Google Maps for location.</w:t>
-      </w:r>
-    </w:p>
-    <w:p>
-      <w:pPr>
-        <w:pStyle w:val="NormalWeb"/>
-        <w:numPr>
-          <w:ilvl w:val="0"/>
-          <w:numId w:val="23"/>
-        </w:numPr>
-      </w:pPr>
-      <w:r>
-        <w:t>WhatsApp and email links for quick contact.</w:t>
-      </w:r>
-    </w:p>
-    <w:p>
-      <w:pPr>
-        <w:pStyle w:val="NormalWeb"/>
-        <w:numPr>
-          <w:ilvl w:val="0"/>
-          <w:numId w:val="23"/>
-        </w:numPr>
-      </w:pPr>
-      <w:r>
-        <w:t>Social media integration (Instagram, Facebook) for marketing.</w:t>
-      </w:r>
-    </w:p>
-    <w:p>
-      <w:pPr>
-        <w:pStyle w:val="NormalWeb"/>
-      </w:pPr>
-      <w:r>
-        <w:rPr>
-          <w:rStyle w:val="Strong"/>
-          <w:rFonts w:eastAsiaTheme="majorEastAsia"/>
-        </w:rPr>
-        <w:t>Testing</w:t>
-      </w:r>
-    </w:p>
-    <w:p>
-      <w:pPr>
-        <w:pStyle w:val="NormalWeb"/>
-        <w:numPr>
-          <w:ilvl w:val="0"/>
-          <w:numId w:val="24"/>
-        </w:numPr>
-      </w:pPr>
-      <w:r>
-        <w:t>Cross</w:t>
-      </w:r>
-      <w:r>
-        <w:noBreakHyphen/>
-        <w:t>browser testing (Chrome, Edge, Safari, Firefox).</w:t>
-      </w:r>
-    </w:p>
-    <w:p>
-      <w:pPr>
-        <w:pStyle w:val="NormalWeb"/>
-        <w:numPr>
-          <w:ilvl w:val="0"/>
-          <w:numId w:val="24"/>
-        </w:numPr>
-      </w:pPr>
-      <w:r>
-        <w:t>Device testing (desktop, tablet, mobile).</w:t>
-      </w:r>
-    </w:p>
-    <w:p>
-      <w:pPr>
-        <w:pStyle w:val="NormalWeb"/>
-        <w:numPr>
-          <w:ilvl w:val="0"/>
-          <w:numId w:val="24"/>
-        </w:numPr>
-      </w:pPr>
-      <w:r>
-        <w:t>Debugging using browser tools before final deployment</w:t>
-      </w:r>
-    </w:p>
-    <w:p>
-      <w:pPr>
-        <w:rPr>
-          <w:sz w:val="22"/>
-          <w:szCs w:val="22"/>
-        </w:rPr>
-      </w:pPr>
-    </w:p>
-    <w:p>
-      <w:pPr>
-        <w:rPr>
-          <w:sz w:val="22"/>
-          <w:szCs w:val="22"/>
-        </w:rPr>
-      </w:pPr>
-    </w:p>
-    <w:p>
-      <w:pPr>
-        <w:rPr>
-          <w:sz w:val="22"/>
-          <w:szCs w:val="22"/>
-        </w:rPr>
-      </w:pPr>
-    </w:p>
-    <w:p>
-      <w:pPr>
-        <w:pStyle w:val="Heading2"/>
-      </w:pPr>
-      <w:r>
-        <w:rPr>
-          <w:rFonts w:ascii="Segoe UI Symbol" w:hAnsi="Segoe UI Symbol" w:cs="Segoe UI Symbol"/>
-        </w:rPr>
-        <w:t>📚</w:t>
-      </w:r>
-      <w:r>
-        <w:t xml:space="preserve"> Research and References</w:t>
-      </w:r>
-    </w:p>
-    <w:p>
-      <w:pPr>
-        <w:pStyle w:val="NormalWeb"/>
-      </w:pPr>
-      <w:r>
-        <w:rPr>
-          <w:rStyle w:val="Strong"/>
-          <w:rFonts w:eastAsiaTheme="majorEastAsia"/>
-        </w:rPr>
-        <w:t>Industry Research</w:t>
-      </w:r>
-      <w:r>
-        <w:t xml:space="preserve"> To ensure Bradley’s Unisex Salon remains competitive, research was conducted into local and international salon practices. The National Hair &amp; Beauty Council of South Africa (NHBCSA) provided industry standards, while competitor websites in Pretoria (such as Sorbet and Carlton Hair) were reviewed for pricing, services, and customer experience. Global salon trend reports were also consulted to align the website with modern digital booking and styling practices.</w:t>
-      </w:r>
-    </w:p>
-    <w:p>
-      <w:pPr>
-        <w:pStyle w:val="NormalWeb"/>
-      </w:pPr>
-      <w:r>
-        <w:rPr>
-          <w:rStyle w:val="Strong"/>
-          <w:rFonts w:eastAsiaTheme="majorEastAsia"/>
-        </w:rPr>
-        <w:t>Technical Research</w:t>
-      </w:r>
-      <w:r>
-        <w:t xml:space="preserve"> Web development tutorials and documentation were used to guide the coding process. W3Schools and Mozilla Developer Network (MDN) provided foundational and advanced knowledge of HTML, CSS, and JavaScript. Bootstrap documentation was reviewed to support responsive design implementation.</w:t>
-      </w:r>
-    </w:p>
-    <w:p>
-      <w:pPr>
-        <w:pStyle w:val="NormalWeb"/>
-      </w:pPr>
-      <w:r>
-        <w:rPr>
-          <w:rStyle w:val="Strong"/>
-          <w:rFonts w:eastAsiaTheme="majorEastAsia"/>
-        </w:rPr>
-        <w:t>Design and Media Sources</w:t>
-      </w:r>
-      <w:r>
-        <w:t xml:space="preserve"> Free high</w:t>
-      </w:r>
-      <w:r>
-        <w:noBreakHyphen/>
-        <w:t>resolution images were sourced from Unsplash and Pexels to enhance the visual appeal of the website. Canva design guides and Google Fonts were consulted to establish a professional color palette and typography consistent with the salon’s brand identity.</w:t>
-      </w:r>
-    </w:p>
-    <w:p>
-      <w:pPr>
-        <w:pStyle w:val="NormalWeb"/>
-      </w:pPr>
-      <w:r>
-        <w:rPr>
-          <w:rStyle w:val="Strong"/>
-          <w:rFonts w:eastAsiaTheme="majorEastAsia"/>
-        </w:rPr>
-        <w:t>Academic and Professional References</w:t>
-      </w:r>
-      <w:r>
-        <w:t xml:space="preserve"> For Proposal 2 (SPCA), the National Council of SPCAs (NSPCA) guidelines were reviewed to ensure accurate representation of animal welfare standards. Digital marketing resources such as HubSpot and Neil Patel’s blogs were used to </w:t>
-      </w:r>
-      <w:r>
-        <w:lastRenderedPageBreak/>
-        <w:t>strengthen strategies for promoting the salon online and engaging with customers through social media.</w:t>
-      </w:r>
-    </w:p>
-    <w:p>
-      <w:pPr>
-        <w:pStyle w:val="Heading3"/>
-      </w:pPr>
-      <w:r>
-        <w:rPr>
-          <w:rFonts w:ascii="Segoe UI Symbol" w:hAnsi="Segoe UI Symbol" w:cs="Segoe UI Symbol"/>
-        </w:rPr>
-        <w:t>📖</w:t>
-      </w:r>
-      <w:r>
-        <w:t xml:space="preserve"> Reference List (Harvard Style)</w:t>
-      </w:r>
-    </w:p>
-    <w:p>
-      <w:pPr>
-        <w:pStyle w:val="NormalWeb"/>
-        <w:numPr>
-          <w:ilvl w:val="0"/>
-          <w:numId w:val="25"/>
-        </w:numPr>
-      </w:pPr>
-      <w:r>
-        <w:t xml:space="preserve">National Hair &amp; Beauty Council of South Africa. (2026). </w:t>
-      </w:r>
-      <w:r>
-        <w:rPr>
-          <w:rStyle w:val="Emphasis"/>
-          <w:rFonts w:eastAsiaTheme="majorEastAsia"/>
-        </w:rPr>
-        <w:t>Salon Industry Standards.</w:t>
-      </w:r>
-      <w:r>
-        <w:t xml:space="preserve"> Available at: </w:t>
-      </w:r>
-      <w:hyperlink r:id="rId19" w:tgtFrame="_blank" w:tooltip="nhbcsa.org.za" w:history="1">
-        <w:r>
-          <w:rPr>
-            <w:rStyle w:val="Hyperlink"/>
-            <w:rFonts w:eastAsiaTheme="majorEastAsia"/>
-          </w:rPr>
-          <w:t>https://nhbcsa.org.za</w:t>
-        </w:r>
-      </w:hyperlink>
-      <w:r>
-        <w:t xml:space="preserve"> [Accessed 14 September 2026].</w:t>
-      </w:r>
-    </w:p>
-    <w:p>
-      <w:pPr>
-        <w:pStyle w:val="NormalWeb"/>
-        <w:numPr>
-          <w:ilvl w:val="0"/>
-          <w:numId w:val="25"/>
-        </w:numPr>
-      </w:pPr>
-      <w:r>
-        <w:t xml:space="preserve">Sorbet Salon Pretoria. (2026). </w:t>
-      </w:r>
-      <w:r>
-        <w:rPr>
-          <w:rStyle w:val="Emphasis"/>
-          <w:rFonts w:eastAsiaTheme="majorEastAsia"/>
-        </w:rPr>
-        <w:t>Services and Pricing.</w:t>
-      </w:r>
-      <w:r>
-        <w:t xml:space="preserve"> Available at: </w:t>
-      </w:r>
-      <w:hyperlink r:id="rId20" w:tgtFrame="_blank" w:tooltip="sorbet.co.za" w:history="1">
-        <w:r>
-          <w:rPr>
-            <w:rStyle w:val="Hyperlink"/>
-            <w:rFonts w:eastAsiaTheme="majorEastAsia"/>
-          </w:rPr>
-          <w:t>https://sorbet.co.za</w:t>
-        </w:r>
-      </w:hyperlink>
-      <w:r>
-        <w:t xml:space="preserve"> [Accessed 14 September 2026].</w:t>
-      </w:r>
-    </w:p>
-    <w:p>
-      <w:pPr>
-        <w:pStyle w:val="NormalWeb"/>
-        <w:numPr>
-          <w:ilvl w:val="0"/>
-          <w:numId w:val="25"/>
-        </w:numPr>
-      </w:pPr>
-      <w:r>
-        <w:t xml:space="preserve">W3Schools. (2026). </w:t>
-      </w:r>
-      <w:r>
-        <w:rPr>
-          <w:rStyle w:val="Emphasis"/>
-          <w:rFonts w:eastAsiaTheme="majorEastAsia"/>
-        </w:rPr>
-        <w:t>HTML Tutorial.</w:t>
-      </w:r>
-      <w:r>
-        <w:t xml:space="preserve"> Available at: </w:t>
-      </w:r>
-      <w:hyperlink r:id="rId21" w:tgtFrame="_blank" w:tooltip="www.w3schools.com" w:history="1">
-        <w:r>
-          <w:rPr>
-            <w:rStyle w:val="Hyperlink"/>
-            <w:rFonts w:eastAsiaTheme="majorEastAsia"/>
-          </w:rPr>
-          <w:t>https://www.w3schools.com/html</w:t>
-        </w:r>
-      </w:hyperlink>
-      <w:r>
-        <w:t xml:space="preserve"> [Accessed 14 September 2026].</w:t>
-      </w:r>
-    </w:p>
-    <w:p>
-      <w:pPr>
-        <w:pStyle w:val="NormalWeb"/>
-        <w:numPr>
-          <w:ilvl w:val="0"/>
-          <w:numId w:val="25"/>
-        </w:numPr>
-      </w:pPr>
-      <w:r>
-        <w:t xml:space="preserve">Mozilla Developer Network. (2026). </w:t>
-      </w:r>
-      <w:r>
-        <w:rPr>
-          <w:rStyle w:val="Emphasis"/>
-          <w:rFonts w:eastAsiaTheme="majorEastAsia"/>
-        </w:rPr>
-        <w:t>Web Development Documentation.</w:t>
-      </w:r>
-      <w:r>
-        <w:t xml:space="preserve"> Available at: </w:t>
-      </w:r>
-      <w:hyperlink r:id="rId22" w:tgtFrame="_blank" w:tooltip="developer.mozilla.org" w:history="1">
-        <w:r>
-          <w:rPr>
-            <w:rStyle w:val="Hyperlink"/>
-            <w:rFonts w:eastAsiaTheme="majorEastAsia"/>
-          </w:rPr>
-          <w:t>https://developer.mozilla.org</w:t>
-        </w:r>
-      </w:hyperlink>
-      <w:r>
-        <w:t xml:space="preserve"> [Accessed 14 September 2026].</w:t>
-      </w:r>
-    </w:p>
-    <w:p>
-      <w:pPr>
-        <w:pStyle w:val="NormalWeb"/>
-        <w:numPr>
-          <w:ilvl w:val="0"/>
-          <w:numId w:val="25"/>
-        </w:numPr>
-      </w:pPr>
-      <w:r>
-        <w:t xml:space="preserve">Bootstrap. (2026). </w:t>
-      </w:r>
-      <w:r>
-        <w:rPr>
-          <w:rStyle w:val="Emphasis"/>
-          <w:rFonts w:eastAsiaTheme="majorEastAsia"/>
-        </w:rPr>
-        <w:t>Responsive Design Framework.</w:t>
-      </w:r>
-      <w:r>
-        <w:t xml:space="preserve"> Available at: </w:t>
-      </w:r>
-      <w:hyperlink r:id="rId23" w:tgtFrame="_blank" w:tooltip="getbootstrap.com" w:history="1">
-        <w:r>
-          <w:rPr>
-            <w:rStyle w:val="Hyperlink"/>
-            <w:rFonts w:eastAsiaTheme="majorEastAsia"/>
-          </w:rPr>
-          <w:t>https://getbootstrap.com</w:t>
-        </w:r>
-      </w:hyperlink>
-      <w:r>
-        <w:t xml:space="preserve"> [Accessed 14 September 2026].</w:t>
-      </w:r>
-    </w:p>
-    <w:p>
-      <w:pPr>
-        <w:pStyle w:val="NormalWeb"/>
-        <w:numPr>
-          <w:ilvl w:val="0"/>
-          <w:numId w:val="25"/>
-        </w:numPr>
-      </w:pPr>
-      <w:r>
-        <w:t xml:space="preserve">Unsplash. (2026). </w:t>
-      </w:r>
-      <w:r>
-        <w:rPr>
-          <w:rStyle w:val="Emphasis"/>
-          <w:rFonts w:eastAsiaTheme="majorEastAsia"/>
-        </w:rPr>
-        <w:t>Free High</w:t>
-      </w:r>
-      <w:r>
-        <w:rPr>
-          <w:rStyle w:val="Emphasis"/>
-          <w:rFonts w:eastAsiaTheme="majorEastAsia"/>
-        </w:rPr>
-        <w:noBreakHyphen/>
-        <w:t>Resolution Photos.</w:t>
-      </w:r>
-      <w:r>
-        <w:t xml:space="preserve"> Available at: </w:t>
-      </w:r>
-      <w:hyperlink r:id="rId24" w:tgtFrame="_blank" w:tooltip="unsplash.com" w:history="1">
-        <w:r>
-          <w:rPr>
-            <w:rStyle w:val="Hyperlink"/>
-            <w:rFonts w:eastAsiaTheme="majorEastAsia"/>
-          </w:rPr>
-          <w:t>https://unsplash.com</w:t>
-        </w:r>
-      </w:hyperlink>
-      <w:r>
-        <w:t xml:space="preserve"> [Accessed 14 September 2026].</w:t>
-      </w:r>
-    </w:p>
-    <w:p>
-      <w:pPr>
-        <w:pStyle w:val="NormalWeb"/>
-        <w:numPr>
-          <w:ilvl w:val="0"/>
-          <w:numId w:val="25"/>
-        </w:numPr>
-      </w:pPr>
-      <w:r>
-        <w:t xml:space="preserve">Pexels. (2026). </w:t>
-      </w:r>
-      <w:r>
-        <w:rPr>
-          <w:rStyle w:val="Emphasis"/>
-          <w:rFonts w:eastAsiaTheme="majorEastAsia"/>
-        </w:rPr>
-        <w:t>Free Stock Photos.</w:t>
-      </w:r>
-      <w:r>
-        <w:t xml:space="preserve"> Available at: </w:t>
-      </w:r>
-      <w:hyperlink r:id="rId25" w:tgtFrame="_blank" w:tooltip="pexels.com" w:history="1">
-        <w:r>
-          <w:rPr>
-            <w:rStyle w:val="Hyperlink"/>
-            <w:rFonts w:eastAsiaTheme="majorEastAsia"/>
-          </w:rPr>
-          <w:t>https://pexels.com</w:t>
-        </w:r>
-      </w:hyperlink>
-      <w:r>
-        <w:t xml:space="preserve"> [Accessed 14 September 2026].</w:t>
-      </w:r>
-    </w:p>
-    <w:p>
-      <w:pPr>
-        <w:pStyle w:val="NormalWeb"/>
-        <w:numPr>
-          <w:ilvl w:val="0"/>
-          <w:numId w:val="25"/>
-        </w:numPr>
-      </w:pPr>
-      <w:r>
-        <w:t xml:space="preserve">HubSpot. (2026). </w:t>
-      </w:r>
-      <w:r>
-        <w:rPr>
-          <w:rStyle w:val="Emphasis"/>
-          <w:rFonts w:eastAsiaTheme="majorEastAsia"/>
-        </w:rPr>
-        <w:t>Digital Marketing for Small Businesses.</w:t>
-      </w:r>
-      <w:r>
-        <w:t xml:space="preserve"> Available at: </w:t>
-      </w:r>
-      <w:hyperlink r:id="rId26" w:tgtFrame="_blank" w:tooltip="hubspot.com" w:history="1">
-        <w:r>
-          <w:rPr>
-            <w:rStyle w:val="Hyperlink"/>
-            <w:rFonts w:eastAsiaTheme="majorEastAsia"/>
-          </w:rPr>
-          <w:t>https://hubspot.com</w:t>
-        </w:r>
-      </w:hyperlink>
-      <w:r>
-        <w:t xml:space="preserve"> [Accessed 14 September 2026].</w:t>
-      </w:r>
-    </w:p>
-    <w:p>
-      <w:pPr>
-        <w:pStyle w:val="NormalWeb"/>
-        <w:numPr>
-          <w:ilvl w:val="0"/>
-          <w:numId w:val="25"/>
-        </w:numPr>
-      </w:pPr>
-      <w:r>
-        <w:t xml:space="preserve">Neil Patel. (2026). </w:t>
-      </w:r>
-      <w:r>
-        <w:rPr>
-          <w:rStyle w:val="Emphasis"/>
-          <w:rFonts w:eastAsiaTheme="majorEastAsia"/>
-        </w:rPr>
-        <w:t>Salon Marketing Strategies.</w:t>
-      </w:r>
-      <w:r>
-        <w:t xml:space="preserve"> Available at: </w:t>
-      </w:r>
-      <w:hyperlink r:id="rId27" w:tgtFrame="_blank" w:tooltip="neilpatel.com" w:history="1">
-        <w:r>
-          <w:rPr>
-            <w:rStyle w:val="Hyperlink"/>
-            <w:rFonts w:eastAsiaTheme="majorEastAsia"/>
-          </w:rPr>
-          <w:t>https://neilpatel.com</w:t>
-        </w:r>
-      </w:hyperlink>
-      <w:r>
-        <w:t xml:space="preserve"> [Accessed 14 September 2026].</w:t>
-      </w:r>
-    </w:p>
-    <w:p>
-      <w:pPr>
-        <w:pStyle w:val="NormalWeb"/>
-        <w:numPr>
-          <w:ilvl w:val="0"/>
-          <w:numId w:val="25"/>
-        </w:numPr>
-      </w:pPr>
-      <w:r>
-        <w:t xml:space="preserve">National Council of SPCAs. (2026). </w:t>
-      </w:r>
-      <w:r>
-        <w:rPr>
-          <w:rStyle w:val="Emphasis"/>
-          <w:rFonts w:eastAsiaTheme="majorEastAsia"/>
-        </w:rPr>
-        <w:t>Animal Welfare Guidelines.</w:t>
-      </w:r>
-      <w:r>
-        <w:t xml:space="preserve"> Available at: </w:t>
-      </w:r>
-      <w:hyperlink r:id="rId28" w:tgtFrame="_blank" w:tooltip="nspca.co.za" w:history="1">
-        <w:r>
-          <w:rPr>
-            <w:rStyle w:val="Hyperlink"/>
-            <w:rFonts w:eastAsiaTheme="majorEastAsia"/>
-          </w:rPr>
-          <w:t>https://nspca.co.za</w:t>
-        </w:r>
-      </w:hyperlink>
-      <w:r>
-        <w:t xml:space="preserve"> [Accessed 14 September 2026]</w:t>
-      </w:r>
-    </w:p>
-    <w:p>
-      <w:pPr>
-        <w:rPr>
-          <w:sz w:val="22"/>
-          <w:szCs w:val="22"/>
-        </w:rPr>
-      </w:pPr>
-    </w:p>
-    <w:p>
-      <w:pPr>
-        <w:rPr>
-          <w:sz w:val="22"/>
-          <w:szCs w:val="22"/>
-        </w:rPr>
-      </w:pPr>
-    </w:p>
-    <w:p>
-      <w:pPr>
-        <w:rPr>
-          <w:sz w:val="22"/>
-          <w:szCs w:val="22"/>
-        </w:rPr>
-      </w:pPr>
-    </w:p>
-    <w:p>
-      <w:pPr>
-        <w:rPr>
-          <w:sz w:val="22"/>
-          <w:szCs w:val="22"/>
-        </w:rPr>
-      </w:pPr>
-    </w:p>
-    <w:p>
-      <w:pPr>
-        <w:rPr>
-          <w:sz w:val="22"/>
-          <w:szCs w:val="22"/>
-        </w:rPr>
-      </w:pPr>
-    </w:p>
-    <w:p>
-      <w:pPr>
-        <w:rPr>
-          <w:sz w:val="22"/>
-          <w:szCs w:val="22"/>
-        </w:rPr>
-      </w:pPr>
-    </w:p>
-    <w:p>
-      <w:pPr>
-        <w:rPr>
-          <w:sz w:val="22"/>
-          <w:szCs w:val="22"/>
-        </w:rPr>
-      </w:pPr>
-    </w:p>
-    <w:p>
-      <w:pPr>
-        <w:rPr>
-          <w:sz w:val="22"/>
-          <w:szCs w:val="22"/>
-        </w:rPr>
-      </w:pPr>
-    </w:p>
-    <w:p>
-      <w:pPr>
-        <w:rPr>
-          <w:sz w:val="22"/>
-          <w:szCs w:val="22"/>
-        </w:rPr>
-      </w:pPr>
-    </w:p>
-    <w:p>
-      <w:pPr>
-        <w:rPr>
-          <w:sz w:val="22"/>
-          <w:szCs w:val="22"/>
-        </w:rPr>
-      </w:pPr>
-    </w:p>
-    <w:p>
-      <w:pPr>
-        <w:rPr>
-          <w:sz w:val="22"/>
-          <w:szCs w:val="22"/>
-        </w:rPr>
-      </w:pPr>
-    </w:p>
-    <w:p>
-      <w:pPr>
-        <w:rPr>
-          <w:sz w:val="22"/>
-          <w:szCs w:val="22"/>
-        </w:rPr>
-      </w:pPr>
-    </w:p>
-    <w:p>
-      <w:pPr>
-        <w:rPr>
-          <w:sz w:val="22"/>
-          <w:szCs w:val="22"/>
-        </w:rPr>
-      </w:pPr>
-    </w:p>
-    <w:p>
-      <w:pPr>
-        <w:rPr>
-          <w:sz w:val="22"/>
-          <w:szCs w:val="22"/>
-        </w:rPr>
-      </w:pPr>
-    </w:p>
-    <w:p>
-      <w:pPr>
-        <w:rPr>
-          <w:sz w:val="22"/>
-          <w:szCs w:val="22"/>
-        </w:rPr>
-      </w:pPr>
-    </w:p>
-    <w:p>
-      <w:pPr>
-        <w:pStyle w:val="Heading3"/>
-      </w:pPr>
-      <w:r>
-        <w:t>Key Fixes I Made</w:t>
-      </w:r>
-    </w:p>
-    <w:p>
-      <w:pPr>
-        <w:pStyle w:val="NormalWeb"/>
-        <w:numPr>
-          <w:ilvl w:val="0"/>
-          <w:numId w:val="26"/>
-        </w:numPr>
-      </w:pPr>
-      <w:r>
-        <w:t xml:space="preserve">Added </w:t>
-      </w:r>
-      <w:r>
-        <w:rPr>
-          <w:rStyle w:val="HTMLCode"/>
-          <w:rFonts w:eastAsiaTheme="majorEastAsia"/>
-        </w:rPr>
-        <w:t>&lt;!DOCTYPE html&gt;</w:t>
-      </w:r>
-      <w:r>
-        <w:t xml:space="preserve"> at the top of each file.</w:t>
-      </w:r>
-    </w:p>
-    <w:p>
-      <w:pPr>
-        <w:pStyle w:val="NormalWeb"/>
-        <w:numPr>
-          <w:ilvl w:val="0"/>
-          <w:numId w:val="26"/>
-        </w:numPr>
-      </w:pPr>
-      <w:r>
-        <w:t xml:space="preserve">Fixed broken </w:t>
-      </w:r>
-      <w:r>
-        <w:rPr>
-          <w:rStyle w:val="HTMLCode"/>
-          <w:rFonts w:eastAsiaTheme="majorEastAsia"/>
-        </w:rPr>
-        <w:t>&lt;img&gt;</w:t>
-      </w:r>
-      <w:r>
-        <w:t xml:space="preserve"> tag in Index (missing closing quote in </w:t>
-      </w:r>
-      <w:r>
-        <w:rPr>
-          <w:rStyle w:val="HTMLCode"/>
-          <w:rFonts w:eastAsiaTheme="majorEastAsia"/>
-        </w:rPr>
-        <w:t>alt</w:t>
-      </w:r>
-      <w:r>
-        <w:t>).</w:t>
-      </w:r>
-    </w:p>
-    <w:p>
-      <w:pPr>
-        <w:pStyle w:val="NormalWeb"/>
-        <w:numPr>
-          <w:ilvl w:val="0"/>
-          <w:numId w:val="26"/>
-        </w:numPr>
-      </w:pPr>
-      <w:r>
-        <w:t xml:space="preserve">Removed misplaced </w:t>
-      </w:r>
-      <w:r>
-        <w:rPr>
-          <w:rStyle w:val="HTMLCode"/>
-          <w:rFonts w:eastAsiaTheme="majorEastAsia"/>
-        </w:rPr>
-        <w:t>&lt;section&gt;</w:t>
-      </w:r>
-      <w:r>
-        <w:t xml:space="preserve"> inside </w:t>
-      </w:r>
-      <w:r>
-        <w:rPr>
-          <w:rStyle w:val="HTMLCode"/>
-          <w:rFonts w:eastAsiaTheme="majorEastAsia"/>
-        </w:rPr>
-        <w:t>&lt;nav&gt;</w:t>
-      </w:r>
-      <w:r>
-        <w:t>.</w:t>
-      </w:r>
-    </w:p>
-    <w:p>
-      <w:pPr>
-        <w:pStyle w:val="NormalWeb"/>
-        <w:numPr>
-          <w:ilvl w:val="0"/>
-          <w:numId w:val="26"/>
-        </w:numPr>
-      </w:pPr>
-      <w:r>
-        <w:t xml:space="preserve">Closed all </w:t>
-      </w:r>
-      <w:r>
-        <w:rPr>
-          <w:rStyle w:val="HTMLCode"/>
-          <w:rFonts w:eastAsiaTheme="majorEastAsia"/>
-        </w:rPr>
-        <w:t>&lt;section&gt;</w:t>
-      </w:r>
-      <w:r>
-        <w:t xml:space="preserve"> tags properly.</w:t>
-      </w:r>
-    </w:p>
-    <w:p>
-      <w:pPr>
-        <w:pStyle w:val="NormalWeb"/>
-        <w:numPr>
-          <w:ilvl w:val="0"/>
-          <w:numId w:val="26"/>
-        </w:numPr>
-      </w:pPr>
-      <w:r>
-        <w:t>Corrected spelling of “queue” instead of “que”.</w:t>
-      </w:r>
-    </w:p>
-    <w:p>
-      <w:pPr>
-        <w:pStyle w:val="NormalWeb"/>
-        <w:numPr>
-          <w:ilvl w:val="0"/>
-          <w:numId w:val="26"/>
-        </w:numPr>
-      </w:pPr>
-      <w:r>
-        <w:t xml:space="preserve">Added </w:t>
-      </w:r>
-      <w:r>
-        <w:rPr>
-          <w:rStyle w:val="HTMLCode"/>
-          <w:rFonts w:eastAsiaTheme="majorEastAsia"/>
-        </w:rPr>
-        <w:t>alt</w:t>
-      </w:r>
-      <w:r>
-        <w:t xml:space="preserve"> attributes to all images for accessibility.</w:t>
-      </w:r>
-    </w:p>
-    <w:p>
-      <w:pPr>
-        <w:pStyle w:val="NormalWeb"/>
-        <w:numPr>
-          <w:ilvl w:val="0"/>
-          <w:numId w:val="26"/>
-        </w:numPr>
-      </w:pPr>
-      <w:r>
-        <w:t>Made navigation consistent across all pages.</w:t>
-      </w:r>
-    </w:p>
-    <w:p>
-      <w:pPr>
-        <w:pStyle w:val="NormalWeb"/>
-        <w:numPr>
-          <w:ilvl w:val="0"/>
-          <w:numId w:val="26"/>
-        </w:numPr>
-      </w:pPr>
-      <w:r>
-        <w:t>Cleaned up indentation and structure for readability.</w:t>
-      </w:r>
-    </w:p>
-    <w:p>
-      <w:pPr>
-        <w:rPr>
-          <w:sz w:val="22"/>
-          <w:szCs w:val="22"/>
-        </w:rPr>
-      </w:pPr>
-    </w:p>
-    <w:p>
-      <w:pPr>
-        <w:rPr>
-          <w:sz w:val="22"/>
-          <w:szCs w:val="22"/>
-        </w:rPr>
-      </w:pPr>
-    </w:p>
-    <w:p>
-      <w:pPr>
-        <w:rPr>
-          <w:sz w:val="22"/>
-          <w:szCs w:val="22"/>
-        </w:rPr>
-      </w:pPr>
-    </w:p>
-    <w:p>
-      <w:pPr>
-        <w:rPr>
-          <w:sz w:val="22"/>
-          <w:szCs w:val="22"/>
-        </w:rPr>
-      </w:pPr>
-    </w:p>
-    <w:p>
-      <w:pPr>
-        <w:rPr>
-          <w:sz w:val="22"/>
-          <w:szCs w:val="22"/>
-        </w:rPr>
-      </w:pPr>
-    </w:p>
-    <w:p>
-      <w:pPr>
-        <w:rPr>
-          <w:sz w:val="22"/>
-          <w:szCs w:val="22"/>
-        </w:rPr>
-      </w:pPr>
-    </w:p>
-    <w:p>
-      <w:pPr>
-        <w:rPr>
-          <w:sz w:val="22"/>
-          <w:szCs w:val="22"/>
-        </w:rPr>
-      </w:pPr>
-    </w:p>
-    <w:p>
-      <w:pPr>
-        <w:rPr>
-          <w:sz w:val="22"/>
-          <w:szCs w:val="22"/>
-        </w:rPr>
-      </w:pPr>
-    </w:p>
-    <w:p>
-      <w:pPr>
-        <w:rPr>
-          <w:sz w:val="22"/>
-          <w:szCs w:val="22"/>
-        </w:rPr>
-      </w:pPr>
-    </w:p>
-    <w:p>
-      <w:pPr>
-        <w:rPr>
-          <w:sz w:val="22"/>
-          <w:szCs w:val="22"/>
-        </w:rPr>
-      </w:pPr>
-    </w:p>
-    <w:p>
-      <w:pPr>
-        <w:rPr>
-          <w:sz w:val="22"/>
-          <w:szCs w:val="22"/>
-        </w:rPr>
-      </w:pPr>
-    </w:p>
-    <w:p>
-      <w:pPr>
-        <w:rPr>
-          <w:sz w:val="22"/>
-          <w:szCs w:val="22"/>
-        </w:rPr>
-      </w:pPr>
-    </w:p>
-    <w:p>
-      <w:pPr>
-        <w:rPr>
-          <w:sz w:val="22"/>
-          <w:szCs w:val="22"/>
-        </w:rPr>
-      </w:pPr>
-    </w:p>
-    <w:p>
-      <w:pPr>
-        <w:rPr>
-          <w:sz w:val="22"/>
-          <w:szCs w:val="22"/>
-        </w:rPr>
-      </w:pPr>
-    </w:p>
-    <w:p>
-      <w:pPr>
-        <w:rPr>
-          <w:sz w:val="22"/>
-          <w:szCs w:val="22"/>
-        </w:rPr>
-      </w:pPr>
-    </w:p>
-    <w:p>
-      <w:pPr>
-        <w:pStyle w:val="Heading2"/>
-      </w:pPr>
-      <w:r>
-        <w:lastRenderedPageBreak/>
-        <w:t>Website Structure &amp; Planning</w:t>
-      </w:r>
-    </w:p>
-    <w:p>
-      <w:pPr>
-        <w:pStyle w:val="Heading3"/>
-      </w:pPr>
-      <w:r>
-        <w:t>1. Sitemap</w:t>
-      </w:r>
-    </w:p>
-    <w:p>
-      <w:pPr>
-        <w:pStyle w:val="NormalWeb"/>
-      </w:pPr>
-      <w:r>
-        <w:t>The Bradley’s Unisex Salon website will have four main pages, all connected through a consistent navigation menu:</w:t>
-      </w:r>
-    </w:p>
-    <w:p>
-      <w:pPr>
-        <w:pStyle w:val="NormalWeb"/>
-        <w:numPr>
-          <w:ilvl w:val="0"/>
-          <w:numId w:val="27"/>
-        </w:numPr>
-      </w:pPr>
-      <w:r>
-        <w:rPr>
-          <w:rStyle w:val="Strong"/>
-          <w:rFonts w:eastAsiaTheme="majorEastAsia"/>
-        </w:rPr>
-        <w:t>Home:</w:t>
-      </w:r>
-      <w:r>
-        <w:t xml:space="preserve"> Welcome message, hero image, featured services, call</w:t>
-      </w:r>
-      <w:r>
-        <w:noBreakHyphen/>
-        <w:t>to</w:t>
-      </w:r>
-      <w:r>
-        <w:noBreakHyphen/>
-        <w:t>action button.</w:t>
-      </w:r>
-    </w:p>
-    <w:p>
-      <w:pPr>
-        <w:pStyle w:val="NormalWeb"/>
-        <w:numPr>
-          <w:ilvl w:val="0"/>
-          <w:numId w:val="27"/>
-        </w:numPr>
-      </w:pPr>
-      <w:r>
-        <w:rPr>
-          <w:rStyle w:val="Strong"/>
-          <w:rFonts w:eastAsiaTheme="majorEastAsia"/>
-        </w:rPr>
-        <w:t>About Us:</w:t>
-      </w:r>
-      <w:r>
-        <w:t xml:space="preserve"> Salon story, mission, team photos, salon interior image.</w:t>
-      </w:r>
-    </w:p>
-    <w:p>
-      <w:pPr>
-        <w:pStyle w:val="NormalWeb"/>
-        <w:numPr>
-          <w:ilvl w:val="0"/>
-          <w:numId w:val="27"/>
-        </w:numPr>
-      </w:pPr>
-      <w:r>
-        <w:rPr>
-          <w:rStyle w:val="Strong"/>
-          <w:rFonts w:eastAsiaTheme="majorEastAsia"/>
-        </w:rPr>
-        <w:t>Services:</w:t>
-      </w:r>
-      <w:r>
-        <w:t xml:space="preserve"> Split into Women’s and Men’s services, each with a list of treatments and prices.</w:t>
-      </w:r>
-    </w:p>
-    <w:p>
-      <w:pPr>
-        <w:pStyle w:val="NormalWeb"/>
-        <w:numPr>
-          <w:ilvl w:val="0"/>
-          <w:numId w:val="27"/>
-        </w:numPr>
-      </w:pPr>
-      <w:r>
-        <w:rPr>
-          <w:rStyle w:val="Strong"/>
-          <w:rFonts w:eastAsiaTheme="majorEastAsia"/>
-        </w:rPr>
-        <w:t>Contact:</w:t>
-      </w:r>
-      <w:r>
-        <w:t xml:space="preserve"> Contact form, map, and contact details (phone, email, WhatsApp, address).</w:t>
-      </w:r>
-    </w:p>
-    <w:p>
-      <w:pPr>
-        <w:pStyle w:val="NormalWeb"/>
-      </w:pPr>
-      <w:r>
-        <w:rPr>
-          <w:rStyle w:val="Strong"/>
-          <w:rFonts w:eastAsiaTheme="majorEastAsia"/>
-        </w:rPr>
-        <w:t>Navigation Flow:</w:t>
-      </w:r>
-      <w:r>
-        <w:t xml:space="preserve"> Home → About Us → Services → Contact (with links back to Home on every page).</w:t>
-      </w:r>
-    </w:p>
-    <w:p>
-      <w:pPr>
-        <w:pStyle w:val="Heading3"/>
-      </w:pPr>
-      <w:r>
-        <w:t>2. Page Layouts</w:t>
-      </w:r>
-    </w:p>
-    <w:p>
-      <w:pPr>
-        <w:pStyle w:val="NormalWeb"/>
-      </w:pPr>
-      <w:r>
-        <w:t>Each page follows a consistent structure:</w:t>
-      </w:r>
-    </w:p>
-    <w:p>
-      <w:pPr>
-        <w:pStyle w:val="NormalWeb"/>
-        <w:numPr>
-          <w:ilvl w:val="0"/>
-          <w:numId w:val="28"/>
-        </w:numPr>
-      </w:pPr>
-      <w:r>
-        <w:rPr>
-          <w:rStyle w:val="Strong"/>
-          <w:rFonts w:eastAsiaTheme="majorEastAsia"/>
-        </w:rPr>
-        <w:t>Header:</w:t>
-      </w:r>
-      <w:r>
-        <w:t xml:space="preserve"> Logo + navigation menu.</w:t>
-      </w:r>
-    </w:p>
-    <w:p>
-      <w:pPr>
-        <w:pStyle w:val="NormalWeb"/>
-        <w:numPr>
-          <w:ilvl w:val="0"/>
-          <w:numId w:val="28"/>
-        </w:numPr>
-      </w:pPr>
-      <w:r>
-        <w:rPr>
-          <w:rStyle w:val="Strong"/>
-          <w:rFonts w:eastAsiaTheme="majorEastAsia"/>
-        </w:rPr>
-        <w:t>Main Content:</w:t>
-      </w:r>
-      <w:r>
-        <w:t xml:space="preserve"> Page</w:t>
-      </w:r>
-      <w:r>
-        <w:noBreakHyphen/>
-        <w:t>specific information (e.g., services list, salon story).</w:t>
-      </w:r>
-    </w:p>
-    <w:p>
-      <w:pPr>
-        <w:pStyle w:val="NormalWeb"/>
-        <w:numPr>
-          <w:ilvl w:val="0"/>
-          <w:numId w:val="28"/>
-        </w:numPr>
-      </w:pPr>
-      <w:r>
-        <w:rPr>
-          <w:rStyle w:val="Strong"/>
-          <w:rFonts w:eastAsiaTheme="majorEastAsia"/>
-        </w:rPr>
-        <w:t>Footer:</w:t>
-      </w:r>
-      <w:r>
-        <w:t xml:space="preserve"> Copyright, contact info, and social media links.</w:t>
-      </w:r>
-    </w:p>
-    <w:p>
-      <w:pPr>
-        <w:rPr>
-          <w:sz w:val="22"/>
-          <w:szCs w:val="22"/>
-        </w:rPr>
-      </w:pPr>
-    </w:p>
-    <w:p>
-      <w:pPr>
-        <w:pStyle w:val="Heading3"/>
-      </w:pPr>
-      <w:r>
-        <w:t>3. File &amp; Folder Organization</w:t>
-      </w:r>
-    </w:p>
-    <w:p>
-      <w:r>
-        <w:t>Code</w:t>
-      </w:r>
-    </w:p>
-    <w:p>
-      <w:pPr>
-        <w:pStyle w:val="HTMLPreformatted"/>
-        <w:rPr>
-          <w:rStyle w:val="HTMLCode"/>
-          <w:rFonts w:eastAsiaTheme="majorEastAsia"/>
-        </w:rPr>
-      </w:pPr>
-      <w:r>
-        <w:rPr>
-          <w:rStyle w:val="HTMLCode"/>
-          <w:rFonts w:eastAsiaTheme="majorEastAsia"/>
-        </w:rPr>
-        <w:t>project/</w:t>
-      </w:r>
-    </w:p>
-    <w:p>
-      <w:pPr>
-        <w:pStyle w:val="HTMLPreformatted"/>
-        <w:rPr>
-          <w:rStyle w:val="HTMLCode"/>
-          <w:rFonts w:eastAsiaTheme="majorEastAsia"/>
-        </w:rPr>
-      </w:pPr>
-      <w:r>
-        <w:rPr>
-          <w:rStyle w:val="HTMLCode"/>
-          <w:rFonts w:eastAsiaTheme="majorEastAsia"/>
-        </w:rPr>
-        <w:t>│── index.html        (Home)</w:t>
-      </w:r>
-    </w:p>
-    <w:p>
-      <w:pPr>
-        <w:pStyle w:val="HTMLPreformatted"/>
-        <w:rPr>
-          <w:rStyle w:val="HTMLCode"/>
-          <w:rFonts w:eastAsiaTheme="majorEastAsia"/>
-        </w:rPr>
-      </w:pPr>
-      <w:r>
-        <w:rPr>
-          <w:rStyle w:val="HTMLCode"/>
-          <w:rFonts w:eastAsiaTheme="majorEastAsia"/>
-        </w:rPr>
-        <w:t>│── about.html        (About Us)</w:t>
-      </w:r>
-    </w:p>
-    <w:p>
-      <w:pPr>
-        <w:pStyle w:val="HTMLPreformatted"/>
-        <w:rPr>
-          <w:rStyle w:val="HTMLCode"/>
-          <w:rFonts w:eastAsiaTheme="majorEastAsia"/>
-        </w:rPr>
-      </w:pPr>
-      <w:r>
-        <w:rPr>
-          <w:rStyle w:val="HTMLCode"/>
-          <w:rFonts w:eastAsiaTheme="majorEastAsia"/>
-        </w:rPr>
-        <w:t>│── services.html     (Services)</w:t>
-      </w:r>
-    </w:p>
-    <w:p>
-      <w:pPr>
-        <w:pStyle w:val="HTMLPreformatted"/>
-        <w:rPr>
-          <w:rStyle w:val="HTMLCode"/>
-          <w:rFonts w:eastAsiaTheme="majorEastAsia"/>
-        </w:rPr>
-      </w:pPr>
-      <w:r>
-        <w:rPr>
-          <w:rStyle w:val="HTMLCode"/>
-          <w:rFonts w:eastAsiaTheme="majorEastAsia"/>
-        </w:rPr>
-        <w:t>│── contact.html      (Contact)</w:t>
-      </w:r>
-    </w:p>
-    <w:p>
-      <w:pPr>
-        <w:pStyle w:val="HTMLPreformatted"/>
-        <w:rPr>
-          <w:rStyle w:val="HTMLCode"/>
-          <w:rFonts w:eastAsiaTheme="majorEastAsia"/>
-        </w:rPr>
-      </w:pPr>
-      <w:r>
-        <w:rPr>
-          <w:rStyle w:val="HTMLCode"/>
-          <w:rFonts w:eastAsiaTheme="majorEastAsia"/>
-        </w:rPr>
-        <w:t>│── css/</w:t>
-      </w:r>
-    </w:p>
-    <w:p>
-      <w:pPr>
-        <w:pStyle w:val="HTMLPreformatted"/>
-        <w:rPr>
-          <w:rStyle w:val="HTMLCode"/>
-          <w:rFonts w:eastAsiaTheme="majorEastAsia"/>
-        </w:rPr>
-      </w:pPr>
-      <w:r>
-        <w:rPr>
-          <w:rStyle w:val="HTMLCode"/>
-          <w:rFonts w:eastAsiaTheme="majorEastAsia"/>
-        </w:rPr>
-        <w:t>│   └── style.css     (shared stylesheet)</w:t>
-      </w:r>
-    </w:p>
-    <w:p>
-      <w:pPr>
-        <w:pStyle w:val="HTMLPreformatted"/>
-        <w:rPr>
-          <w:rStyle w:val="HTMLCode"/>
-          <w:rFonts w:eastAsiaTheme="majorEastAsia"/>
-        </w:rPr>
-      </w:pPr>
-      <w:r>
-        <w:rPr>
-          <w:rStyle w:val="HTMLCode"/>
-          <w:rFonts w:eastAsiaTheme="majorEastAsia"/>
-        </w:rPr>
-        <w:t>│── images/</w:t>
-      </w:r>
-    </w:p>
-    <w:p>
-      <w:pPr>
-        <w:pStyle w:val="HTMLPreformatted"/>
-        <w:rPr>
-          <w:rStyle w:val="HTMLCode"/>
-          <w:rFonts w:eastAsiaTheme="majorEastAsia"/>
-        </w:rPr>
-      </w:pPr>
-      <w:r>
-        <w:rPr>
-          <w:rStyle w:val="HTMLCode"/>
-          <w:rFonts w:eastAsiaTheme="majorEastAsia"/>
-        </w:rPr>
-        <w:t>│   └── logo.png</w:t>
-      </w:r>
-    </w:p>
-    <w:p>
-      <w:pPr>
-        <w:pStyle w:val="HTMLPreformatted"/>
-        <w:rPr>
-          <w:rStyle w:val="HTMLCode"/>
-          <w:rFonts w:eastAsiaTheme="majorEastAsia"/>
-        </w:rPr>
-      </w:pPr>
-      <w:r>
-        <w:rPr>
-          <w:rStyle w:val="HTMLCode"/>
-          <w:rFonts w:eastAsiaTheme="majorEastAsia"/>
-        </w:rPr>
-        <w:t>│   └── inside-salon.jpeg</w:t>
-      </w:r>
-    </w:p>
-    <w:p>
-      <w:pPr>
-        <w:pStyle w:val="HTMLPreformatted"/>
-        <w:rPr>
-          <w:rStyle w:val="HTMLCode"/>
-          <w:rFonts w:eastAsiaTheme="majorEastAsia"/>
-        </w:rPr>
-      </w:pPr>
-      <w:r>
-        <w:rPr>
-          <w:rStyle w:val="HTMLCode"/>
-          <w:rFonts w:eastAsiaTheme="majorEastAsia"/>
-        </w:rPr>
-        <w:t>│   └── queens.webp</w:t>
-      </w:r>
-    </w:p>
-    <w:p>
-      <w:pPr>
-        <w:pStyle w:val="HTMLPreformatted"/>
-        <w:rPr>
-          <w:rStyle w:val="HTMLCode"/>
-          <w:rFonts w:eastAsiaTheme="majorEastAsia"/>
-        </w:rPr>
-      </w:pPr>
-      <w:r>
-        <w:rPr>
-          <w:rStyle w:val="HTMLCode"/>
-          <w:rFonts w:eastAsiaTheme="majorEastAsia"/>
-        </w:rPr>
-        <w:t>│   └── men.webp</w:t>
-      </w:r>
-    </w:p>
-    <w:p>
-      <w:pPr>
-        <w:pStyle w:val="Heading3"/>
-      </w:pPr>
-      <w:r>
-        <w:t>4. Consistency Plan</w:t>
-      </w:r>
-    </w:p>
-    <w:p>
-      <w:pPr>
-        <w:pStyle w:val="NormalWeb"/>
-        <w:numPr>
-          <w:ilvl w:val="0"/>
-          <w:numId w:val="29"/>
-        </w:numPr>
-      </w:pPr>
-      <w:r>
-        <w:t>Same header and footer across all pages.</w:t>
-      </w:r>
-    </w:p>
-    <w:p>
-      <w:pPr>
-        <w:pStyle w:val="NormalWeb"/>
-        <w:numPr>
-          <w:ilvl w:val="0"/>
-          <w:numId w:val="29"/>
-        </w:numPr>
-      </w:pPr>
-      <w:r>
-        <w:t>Navigation menu links appear in the same order everywhere.</w:t>
-      </w:r>
-    </w:p>
-    <w:p>
-      <w:pPr>
-        <w:pStyle w:val="NormalWeb"/>
-        <w:numPr>
-          <w:ilvl w:val="0"/>
-          <w:numId w:val="29"/>
-        </w:numPr>
-      </w:pPr>
-      <w:r>
-        <w:t xml:space="preserve">Fonts, colors, and spacing controlled by a single </w:t>
-      </w:r>
-      <w:r>
-        <w:rPr>
-          <w:rStyle w:val="HTMLCode"/>
-          <w:rFonts w:eastAsiaTheme="majorEastAsia"/>
-        </w:rPr>
-        <w:t>style.css</w:t>
-      </w:r>
-      <w:r>
-        <w:t xml:space="preserve"> file.</w:t>
-      </w:r>
-    </w:p>
-    <w:p>
-      <w:pPr>
-        <w:pStyle w:val="NormalWeb"/>
-        <w:numPr>
-          <w:ilvl w:val="0"/>
-          <w:numId w:val="29"/>
-        </w:numPr>
-      </w:pPr>
-      <w:r>
-        <w:lastRenderedPageBreak/>
-        <w:t>Semantic HTML5 tags (</w:t>
-      </w:r>
-      <w:r>
-        <w:rPr>
-          <w:rStyle w:val="HTMLCode"/>
-          <w:rFonts w:eastAsiaTheme="majorEastAsia"/>
-        </w:rPr>
-        <w:t>&lt;header&gt;</w:t>
-      </w:r>
-      <w:r>
-        <w:t xml:space="preserve">, </w:t>
-      </w:r>
-      <w:r>
-        <w:rPr>
-          <w:rStyle w:val="HTMLCode"/>
-          <w:rFonts w:eastAsiaTheme="majorEastAsia"/>
-        </w:rPr>
-        <w:t>&lt;nav&gt;</w:t>
-      </w:r>
-      <w:r>
-        <w:t xml:space="preserve">, </w:t>
-      </w:r>
-      <w:r>
-        <w:rPr>
-          <w:rStyle w:val="HTMLCode"/>
-          <w:rFonts w:eastAsiaTheme="majorEastAsia"/>
-        </w:rPr>
-        <w:t>&lt;main&gt;</w:t>
-      </w:r>
-      <w:r>
-        <w:t xml:space="preserve">, </w:t>
-      </w:r>
-      <w:r>
-        <w:rPr>
-          <w:rStyle w:val="HTMLCode"/>
-          <w:rFonts w:eastAsiaTheme="majorEastAsia"/>
-        </w:rPr>
-        <w:t>&lt;section&gt;</w:t>
-      </w:r>
-      <w:r>
-        <w:t xml:space="preserve">, </w:t>
-      </w:r>
-      <w:r>
-        <w:rPr>
-          <w:rStyle w:val="HTMLCode"/>
-          <w:rFonts w:eastAsiaTheme="majorEastAsia"/>
-        </w:rPr>
-        <w:t>&lt;footer&gt;</w:t>
-      </w:r>
-      <w:r>
-        <w:t>) used throughout.</w:t>
-      </w:r>
-    </w:p>
-    <w:p>
-      <w:pPr>
-        <w:pStyle w:val="Heading3"/>
-      </w:pPr>
-      <w:r>
-        <w:t>5. User Journey</w:t>
-      </w:r>
-    </w:p>
-    <w:p>
-      <w:pPr>
-        <w:pStyle w:val="NormalWeb"/>
-        <w:numPr>
-          <w:ilvl w:val="0"/>
-          <w:numId w:val="30"/>
-        </w:numPr>
-      </w:pPr>
-      <w:r>
-        <w:t xml:space="preserve">Visitors land on </w:t>
-      </w:r>
-      <w:r>
-        <w:rPr>
-          <w:rStyle w:val="Strong"/>
-          <w:rFonts w:eastAsiaTheme="majorEastAsia"/>
-        </w:rPr>
-        <w:t>Home</w:t>
-      </w:r>
-      <w:r>
-        <w:t xml:space="preserve"> → see welcome message and featured services.</w:t>
-      </w:r>
-    </w:p>
-    <w:p>
-      <w:pPr>
-        <w:pStyle w:val="NormalWeb"/>
-        <w:numPr>
-          <w:ilvl w:val="0"/>
-          <w:numId w:val="30"/>
-        </w:numPr>
-      </w:pPr>
-      <w:r>
-        <w:t xml:space="preserve">They click </w:t>
-      </w:r>
-      <w:r>
-        <w:rPr>
-          <w:rStyle w:val="Strong"/>
-          <w:rFonts w:eastAsiaTheme="majorEastAsia"/>
-        </w:rPr>
-        <w:t>About Us</w:t>
-      </w:r>
-      <w:r>
-        <w:t xml:space="preserve"> → learn about the salon and team.</w:t>
-      </w:r>
-    </w:p>
-    <w:p>
-      <w:pPr>
-        <w:pStyle w:val="NormalWeb"/>
-        <w:numPr>
-          <w:ilvl w:val="0"/>
-          <w:numId w:val="30"/>
-        </w:numPr>
-      </w:pPr>
-      <w:r>
-        <w:t xml:space="preserve">They click </w:t>
-      </w:r>
-      <w:r>
-        <w:rPr>
-          <w:rStyle w:val="Strong"/>
-          <w:rFonts w:eastAsiaTheme="majorEastAsia"/>
-        </w:rPr>
-        <w:t>Services</w:t>
-      </w:r>
-      <w:r>
-        <w:t xml:space="preserve"> → view detailed pricing and options.</w:t>
-      </w:r>
-    </w:p>
-    <w:p>
-      <w:pPr>
-        <w:pStyle w:val="NormalWeb"/>
-        <w:numPr>
-          <w:ilvl w:val="0"/>
-          <w:numId w:val="30"/>
-        </w:numPr>
-      </w:pPr>
-      <w:r>
-        <w:t xml:space="preserve">They click </w:t>
-      </w:r>
-      <w:r>
-        <w:rPr>
-          <w:rStyle w:val="Strong"/>
-          <w:rFonts w:eastAsiaTheme="majorEastAsia"/>
-        </w:rPr>
-        <w:t>Contact</w:t>
-      </w:r>
-      <w:r>
-        <w:t xml:space="preserve"> → book via form, WhatsApp, or email, and find the salon location.</w:t>
-      </w:r>
-    </w:p>
-    <w:p>
-      <w:pPr>
-        <w:pStyle w:val="Heading3"/>
-      </w:pPr>
-      <w:r>
-        <w:t>6. Sitemap Diagram</w:t>
-      </w:r>
-    </w:p>
-    <w:p>
-      <w:pPr>
-        <w:rPr>
-          <w:sz w:val="22"/>
-          <w:szCs w:val="22"/>
-        </w:rPr>
-      </w:pPr>
-    </w:p>
-    <w:p>
-      <w:pPr>
-        <w:rPr>
-          <w:sz w:val="22"/>
-          <w:szCs w:val="22"/>
-        </w:rPr>
-      </w:pPr>
-    </w:p>
-    <w:p>
-      <w:pPr>
-        <w:pStyle w:val="Heading2"/>
-      </w:pPr>
-      <w:r>
-        <w:rPr>
-          <w:rFonts w:ascii="Arial" w:hAnsi="Arial" w:cs="Arial"/>
-        </w:rPr>
-        <w:t>🧩</w:t>
-      </w:r>
-      <w:r>
-        <w:t xml:space="preserve"> Summary of Changes</w:t>
-      </w:r>
-    </w:p>
-    <w:p>
-      <w:pPr>
-        <w:pStyle w:val="Heading3"/>
-      </w:pPr>
-      <w:r>
-        <w:t xml:space="preserve">1. </w:t>
-      </w:r>
-      <w:r>
-        <w:rPr>
-          <w:rStyle w:val="Strong"/>
-          <w:b w:val="0"/>
-          <w:bCs w:val="0"/>
-        </w:rPr>
-        <w:t>Improved Organization</w:t>
-      </w:r>
-    </w:p>
-    <w:p>
-      <w:pPr>
-        <w:pStyle w:val="NormalWeb"/>
-        <w:numPr>
-          <w:ilvl w:val="0"/>
-          <w:numId w:val="31"/>
-        </w:numPr>
-      </w:pPr>
-      <w:r>
-        <w:t xml:space="preserve">Your pages (Home, About, Services, Contact) were reorganized into a </w:t>
-      </w:r>
-      <w:r>
-        <w:rPr>
-          <w:rStyle w:val="Strong"/>
-          <w:rFonts w:eastAsiaTheme="majorEastAsia"/>
-        </w:rPr>
-        <w:t>logical sitemap</w:t>
-      </w:r>
-      <w:r>
-        <w:t xml:space="preserve"> showing how users move through the site.</w:t>
-      </w:r>
-    </w:p>
-    <w:p>
-      <w:pPr>
-        <w:pStyle w:val="NormalWeb"/>
-        <w:numPr>
-          <w:ilvl w:val="0"/>
-          <w:numId w:val="31"/>
-        </w:numPr>
-      </w:pPr>
-      <w:r>
-        <w:t>Each page now has a clear purpose and consistent layout (Header → Main → Footer).</w:t>
-      </w:r>
-    </w:p>
-    <w:p>
-      <w:pPr>
-        <w:pStyle w:val="Heading3"/>
-      </w:pPr>
-      <w:r>
-        <w:t xml:space="preserve">2. </w:t>
-      </w:r>
-      <w:r>
-        <w:rPr>
-          <w:rStyle w:val="Strong"/>
-          <w:b w:val="0"/>
-          <w:bCs w:val="0"/>
-        </w:rPr>
-        <w:t>Added Sitemap Diagram</w:t>
-      </w:r>
-    </w:p>
-    <w:p>
-      <w:pPr>
-        <w:pStyle w:val="NormalWeb"/>
-        <w:numPr>
-          <w:ilvl w:val="0"/>
-          <w:numId w:val="32"/>
-        </w:numPr>
-      </w:pPr>
-      <w:r>
-        <w:t>A visual flowchart was created to show how all pages connect.</w:t>
-      </w:r>
-    </w:p>
-    <w:p>
-      <w:pPr>
-        <w:pStyle w:val="NormalWeb"/>
-        <w:numPr>
-          <w:ilvl w:val="0"/>
-          <w:numId w:val="32"/>
-        </w:numPr>
-      </w:pPr>
-      <w:r>
-        <w:t>This diagram strengthens your POE by proving you planned navigation before coding.</w:t>
-      </w:r>
-    </w:p>
-    <w:p>
-      <w:pPr>
-        <w:pStyle w:val="Heading3"/>
-      </w:pPr>
-      <w:r>
-        <w:t xml:space="preserve">3. </w:t>
-      </w:r>
-      <w:r>
-        <w:rPr>
-          <w:rStyle w:val="Strong"/>
-          <w:b w:val="0"/>
-          <w:bCs w:val="0"/>
-        </w:rPr>
-        <w:t>File &amp; Folder Structure</w:t>
-      </w:r>
-    </w:p>
-    <w:p>
-      <w:pPr>
-        <w:pStyle w:val="NormalWeb"/>
-        <w:numPr>
-          <w:ilvl w:val="0"/>
-          <w:numId w:val="33"/>
-        </w:numPr>
-      </w:pPr>
-      <w:r>
-        <w:t>I added a clean folder layout showing where HTML, CSS, and images should go.</w:t>
-      </w:r>
-    </w:p>
-    <w:p>
-      <w:pPr>
-        <w:pStyle w:val="NormalWeb"/>
-        <w:numPr>
-          <w:ilvl w:val="0"/>
-          <w:numId w:val="33"/>
-        </w:numPr>
-      </w:pPr>
-      <w:r>
-        <w:t>This helps you demonstrate technical planning and version control readiness.</w:t>
-      </w:r>
-    </w:p>
-    <w:p>
-      <w:pPr>
-        <w:pStyle w:val="Heading3"/>
-      </w:pPr>
-      <w:r>
-        <w:t xml:space="preserve">4. </w:t>
-      </w:r>
-      <w:r>
-        <w:rPr>
-          <w:rStyle w:val="Strong"/>
-          <w:b w:val="0"/>
-          <w:bCs w:val="0"/>
-        </w:rPr>
-        <w:t>Consistency Plan</w:t>
-      </w:r>
-    </w:p>
-    <w:p>
-      <w:pPr>
-        <w:pStyle w:val="NormalWeb"/>
-        <w:numPr>
-          <w:ilvl w:val="0"/>
-          <w:numId w:val="34"/>
-        </w:numPr>
-      </w:pPr>
-      <w:r>
-        <w:t>Defined rules for keeping the same header, footer, and navigation across all pages.</w:t>
-      </w:r>
-    </w:p>
-    <w:p>
-      <w:pPr>
-        <w:pStyle w:val="NormalWeb"/>
-        <w:numPr>
-          <w:ilvl w:val="0"/>
-          <w:numId w:val="34"/>
-        </w:numPr>
-      </w:pPr>
-      <w:r>
-        <w:t>Ensures your site looks professional and cohesive.</w:t>
-      </w:r>
-    </w:p>
-    <w:p>
-      <w:pPr>
-        <w:pStyle w:val="Heading3"/>
-      </w:pPr>
-      <w:r>
-        <w:t xml:space="preserve">5. </w:t>
-      </w:r>
-      <w:r>
-        <w:rPr>
-          <w:rStyle w:val="Strong"/>
-          <w:b w:val="0"/>
-          <w:bCs w:val="0"/>
-        </w:rPr>
-        <w:t>User Journey</w:t>
-      </w:r>
-    </w:p>
-    <w:p>
-      <w:pPr>
-        <w:pStyle w:val="NormalWeb"/>
-        <w:numPr>
-          <w:ilvl w:val="0"/>
-          <w:numId w:val="35"/>
-        </w:numPr>
-      </w:pPr>
-      <w:r>
-        <w:t>Explained how visitors will move through your site — from Home to Contact.</w:t>
-      </w:r>
-    </w:p>
-    <w:p>
-      <w:pPr>
-        <w:pStyle w:val="NormalWeb"/>
-        <w:numPr>
-          <w:ilvl w:val="0"/>
-          <w:numId w:val="35"/>
-        </w:numPr>
-      </w:pPr>
-      <w:r>
-        <w:t>This shows you understand user experience (UX) design.</w:t>
-      </w:r>
-    </w:p>
-    <w:p>
-      <w:pPr>
-        <w:pStyle w:val="Heading3"/>
-      </w:pPr>
-      <w:r>
-        <w:lastRenderedPageBreak/>
-        <w:t xml:space="preserve">6. </w:t>
-      </w:r>
-      <w:r>
-        <w:rPr>
-          <w:rStyle w:val="Strong"/>
-          <w:b w:val="0"/>
-          <w:bCs w:val="0"/>
-        </w:rPr>
-        <w:t>Semantic HTML Emphasis</w:t>
-      </w:r>
-    </w:p>
-    <w:p>
-      <w:pPr>
-        <w:pStyle w:val="NormalWeb"/>
-        <w:numPr>
-          <w:ilvl w:val="0"/>
-          <w:numId w:val="36"/>
-        </w:numPr>
-      </w:pPr>
-      <w:r>
-        <w:t>Highlighted the use of proper HTML5 tags (</w:t>
-      </w:r>
-      <w:r>
-        <w:rPr>
-          <w:rStyle w:val="HTMLCode"/>
-          <w:rFonts w:eastAsiaTheme="majorEastAsia"/>
-        </w:rPr>
-        <w:t>&lt;header&gt;</w:t>
-      </w:r>
-      <w:r>
-        <w:t xml:space="preserve">, </w:t>
-      </w:r>
-      <w:r>
-        <w:rPr>
-          <w:rStyle w:val="HTMLCode"/>
-          <w:rFonts w:eastAsiaTheme="majorEastAsia"/>
-        </w:rPr>
-        <w:t>&lt;nav&gt;</w:t>
-      </w:r>
-      <w:r>
-        <w:t xml:space="preserve">, </w:t>
-      </w:r>
-      <w:r>
-        <w:rPr>
-          <w:rStyle w:val="HTMLCode"/>
-          <w:rFonts w:eastAsiaTheme="majorEastAsia"/>
-        </w:rPr>
-        <w:t>&lt;main&gt;</w:t>
-      </w:r>
-      <w:r>
-        <w:t xml:space="preserve">, </w:t>
-      </w:r>
-      <w:r>
-        <w:rPr>
-          <w:rStyle w:val="HTMLCode"/>
-          <w:rFonts w:eastAsiaTheme="majorEastAsia"/>
-        </w:rPr>
-        <w:t>&lt;section&gt;</w:t>
-      </w:r>
-      <w:r>
-        <w:t xml:space="preserve">, </w:t>
-      </w:r>
-      <w:r>
-        <w:rPr>
-          <w:rStyle w:val="HTMLCode"/>
-          <w:rFonts w:eastAsiaTheme="majorEastAsia"/>
-        </w:rPr>
-        <w:t>&lt;footer&gt;</w:t>
-      </w:r>
-      <w:r>
-        <w:t>).</w:t>
-      </w:r>
-    </w:p>
-    <w:p>
-      <w:pPr>
-        <w:pStyle w:val="NormalWeb"/>
-        <w:numPr>
-          <w:ilvl w:val="0"/>
-          <w:numId w:val="36"/>
-        </w:numPr>
-      </w:pPr>
-      <w:r>
-        <w:t>This improves accessibility and earns marks for technical correctness.</w:t>
-      </w:r>
-    </w:p>
-    <w:p>
-      <w:pPr>
-        <w:pStyle w:val="Heading3"/>
-      </w:pPr>
-      <w:r>
-        <w:t xml:space="preserve">7. </w:t>
-      </w:r>
-      <w:r>
-        <w:rPr>
-          <w:rStyle w:val="Strong"/>
-          <w:b w:val="0"/>
-          <w:bCs w:val="0"/>
-        </w:rPr>
-        <w:t>Visual + Written Integration</w:t>
-      </w:r>
-    </w:p>
-    <w:p>
-      <w:pPr>
-        <w:pStyle w:val="NormalWeb"/>
-        <w:numPr>
-          <w:ilvl w:val="0"/>
-          <w:numId w:val="37"/>
-        </w:numPr>
-      </w:pPr>
-      <w:r>
-        <w:t xml:space="preserve">Combined the </w:t>
-      </w:r>
-      <w:r>
-        <w:rPr>
-          <w:rStyle w:val="Strong"/>
-          <w:rFonts w:eastAsiaTheme="majorEastAsia"/>
-        </w:rPr>
-        <w:t>text explanation</w:t>
-      </w:r>
-      <w:r>
-        <w:t xml:space="preserve"> and </w:t>
-      </w:r>
-      <w:r>
-        <w:rPr>
-          <w:rStyle w:val="Strong"/>
-          <w:rFonts w:eastAsiaTheme="majorEastAsia"/>
-        </w:rPr>
-        <w:t>sitemap image</w:t>
-      </w:r>
-      <w:r>
-        <w:t xml:space="preserve"> into one section.</w:t>
-      </w:r>
-    </w:p>
-    <w:p>
-      <w:pPr>
-        <w:pStyle w:val="NormalWeb"/>
-        <w:numPr>
-          <w:ilvl w:val="0"/>
-          <w:numId w:val="37"/>
-        </w:numPr>
-      </w:pPr>
-      <w:r>
-        <w:t>This meets the POE rubric’s requirement for both visual and written planning evidence.</w:t>
-      </w:r>
-    </w:p>
-    <w:p>
-      <w:pPr>
-        <w:rPr>
-          <w:sz w:val="22"/>
-          <w:szCs w:val="22"/>
-        </w:rPr>
-      </w:pPr>
-    </w:p>
-    <w:p>
-      <w:pPr>
-        <w:rPr>
-          <w:sz w:val="22"/>
-          <w:szCs w:val="22"/>
-        </w:rPr>
-      </w:pPr>
-    </w:p>
-    <w:p>
-      <w:pPr>
-        <w:pStyle w:val="Heading2"/>
-      </w:pPr>
-      <w:r>
-        <w:rPr>
-          <w:rFonts w:ascii="Arial" w:hAnsi="Arial" w:cs="Arial"/>
-        </w:rPr>
-        <w:t>🧩</w:t>
-      </w:r>
-      <w:r>
-        <w:t xml:space="preserve"> Index (Home Page)</w:t>
-      </w:r>
-    </w:p>
-    <w:p>
-      <w:pPr>
-        <w:pStyle w:val="NormalWeb"/>
-        <w:numPr>
-          <w:ilvl w:val="0"/>
-          <w:numId w:val="38"/>
-        </w:numPr>
-      </w:pPr>
-      <w:r>
-        <w:t xml:space="preserve">Added </w:t>
-      </w:r>
-      <w:r>
-        <w:rPr>
-          <w:rStyle w:val="HTMLCode"/>
-          <w:rFonts w:eastAsiaTheme="majorEastAsia"/>
-        </w:rPr>
-        <w:t>&lt;!DOCTYPE html&gt;</w:t>
-      </w:r>
-      <w:r>
-        <w:t xml:space="preserve"> at the top for proper HTML5 declaration.</w:t>
-      </w:r>
-    </w:p>
-    <w:p>
-      <w:pPr>
-        <w:pStyle w:val="NormalWeb"/>
-        <w:numPr>
-          <w:ilvl w:val="0"/>
-          <w:numId w:val="38"/>
-        </w:numPr>
-      </w:pPr>
-      <w:r>
-        <w:t xml:space="preserve">Fixed the broken </w:t>
-      </w:r>
-      <w:r>
-        <w:rPr>
-          <w:rStyle w:val="HTMLCode"/>
-          <w:rFonts w:eastAsiaTheme="majorEastAsia"/>
-        </w:rPr>
-        <w:t>&lt;img&gt;</w:t>
-      </w:r>
-      <w:r>
-        <w:t xml:space="preserve"> tag (the </w:t>
-      </w:r>
-      <w:r>
-        <w:rPr>
-          <w:rStyle w:val="HTMLCode"/>
-          <w:rFonts w:eastAsiaTheme="majorEastAsia"/>
-        </w:rPr>
-        <w:t>alt</w:t>
-      </w:r>
-      <w:r>
-        <w:t xml:space="preserve"> attribute was missing a closing quote).</w:t>
-      </w:r>
-    </w:p>
-    <w:p>
-      <w:pPr>
-        <w:pStyle w:val="NormalWeb"/>
-        <w:numPr>
-          <w:ilvl w:val="0"/>
-          <w:numId w:val="38"/>
-        </w:numPr>
-      </w:pPr>
-      <w:r>
-        <w:t xml:space="preserve">Removed the misplaced </w:t>
-      </w:r>
-      <w:r>
-        <w:rPr>
-          <w:rStyle w:val="HTMLCode"/>
-          <w:rFonts w:eastAsiaTheme="majorEastAsia"/>
-        </w:rPr>
-        <w:t>&lt;section&gt;</w:t>
-      </w:r>
-      <w:r>
-        <w:t xml:space="preserve"> inside </w:t>
-      </w:r>
-      <w:r>
-        <w:rPr>
-          <w:rStyle w:val="HTMLCode"/>
-          <w:rFonts w:eastAsiaTheme="majorEastAsia"/>
-        </w:rPr>
-        <w:t>&lt;nav&gt;</w:t>
-      </w:r>
-      <w:r>
-        <w:t xml:space="preserve"> (sections belong in </w:t>
-      </w:r>
-      <w:r>
-        <w:rPr>
-          <w:rStyle w:val="HTMLCode"/>
-          <w:rFonts w:eastAsiaTheme="majorEastAsia"/>
-        </w:rPr>
-        <w:t>&lt;main&gt;</w:t>
-      </w:r>
-      <w:r>
-        <w:t>).</w:t>
-      </w:r>
-    </w:p>
-    <w:p>
-      <w:pPr>
-        <w:pStyle w:val="NormalWeb"/>
-        <w:numPr>
-          <w:ilvl w:val="0"/>
-          <w:numId w:val="38"/>
-        </w:numPr>
-      </w:pPr>
-      <w:r>
-        <w:t>Corrected spelling of “queue” instead of “que.”</w:t>
-      </w:r>
-    </w:p>
-    <w:p>
-      <w:pPr>
-        <w:pStyle w:val="NormalWeb"/>
-        <w:numPr>
-          <w:ilvl w:val="0"/>
-          <w:numId w:val="38"/>
-        </w:numPr>
-      </w:pPr>
-      <w:r>
-        <w:t xml:space="preserve">Added </w:t>
-      </w:r>
-      <w:r>
-        <w:rPr>
-          <w:rStyle w:val="Strong"/>
-          <w:rFonts w:eastAsiaTheme="majorEastAsia"/>
-        </w:rPr>
-        <w:t>comments (</w:t>
-      </w:r>
-      <w:r>
-        <w:rPr>
-          <w:rStyle w:val="HTMLCode"/>
-          <w:rFonts w:eastAsiaTheme="majorEastAsia"/>
-        </w:rPr>
-        <w:t>&lt;!-- ... --&gt;</w:t>
-      </w:r>
-      <w:r>
-        <w:rPr>
-          <w:rStyle w:val="Strong"/>
-          <w:rFonts w:eastAsiaTheme="majorEastAsia"/>
-        </w:rPr>
-        <w:t>)</w:t>
-      </w:r>
-      <w:r>
-        <w:t xml:space="preserve"> explaining each section (header, nav, main, footer).</w:t>
-      </w:r>
-    </w:p>
-    <w:p>
-      <w:pPr>
-        <w:pStyle w:val="NormalWeb"/>
-        <w:numPr>
-          <w:ilvl w:val="0"/>
-          <w:numId w:val="38"/>
-        </w:numPr>
-      </w:pPr>
-      <w:r>
-        <w:t>Cleaned indentation for readability.</w:t>
-      </w:r>
-    </w:p>
-    <w:p>
-      <w:pPr>
-        <w:pStyle w:val="Heading2"/>
-      </w:pPr>
-      <w:r>
-        <w:rPr>
-          <w:rFonts w:ascii="Segoe UI Symbol" w:hAnsi="Segoe UI Symbol" w:cs="Segoe UI Symbol"/>
-        </w:rPr>
-        <w:t>💇</w:t>
-      </w:r>
-      <w:r>
-        <w:t xml:space="preserve"> About Page</w:t>
-      </w:r>
-    </w:p>
-    <w:p>
-      <w:pPr>
-        <w:pStyle w:val="NormalWeb"/>
-        <w:numPr>
-          <w:ilvl w:val="0"/>
-          <w:numId w:val="39"/>
-        </w:numPr>
-      </w:pPr>
-      <w:r>
-        <w:t>Added consistent navigation links (Home, Services, Contact).</w:t>
-      </w:r>
-    </w:p>
-    <w:p>
-      <w:pPr>
-        <w:pStyle w:val="NormalWeb"/>
-        <w:numPr>
-          <w:ilvl w:val="0"/>
-          <w:numId w:val="39"/>
-        </w:numPr>
-      </w:pPr>
-      <w:r>
-        <w:t xml:space="preserve">Split long text into multiple </w:t>
-      </w:r>
-      <w:r>
-        <w:rPr>
-          <w:rStyle w:val="HTMLCode"/>
-          <w:rFonts w:eastAsiaTheme="majorEastAsia"/>
-        </w:rPr>
-        <w:t>&lt;p&gt;</w:t>
-      </w:r>
-      <w:r>
-        <w:t xml:space="preserve"> tags for readability.</w:t>
-      </w:r>
-    </w:p>
-    <w:p>
-      <w:pPr>
-        <w:pStyle w:val="NormalWeb"/>
-        <w:numPr>
-          <w:ilvl w:val="0"/>
-          <w:numId w:val="39"/>
-        </w:numPr>
-      </w:pPr>
-      <w:r>
-        <w:t xml:space="preserve">Added </w:t>
-      </w:r>
-      <w:r>
-        <w:rPr>
-          <w:rStyle w:val="HTMLCode"/>
-          <w:rFonts w:eastAsiaTheme="majorEastAsia"/>
-        </w:rPr>
-        <w:t>alt</w:t>
-      </w:r>
-      <w:r>
-        <w:t xml:space="preserve"> attributes to all images for accessibility.</w:t>
-      </w:r>
-    </w:p>
-    <w:p>
-      <w:pPr>
-        <w:pStyle w:val="NormalWeb"/>
-        <w:numPr>
-          <w:ilvl w:val="0"/>
-          <w:numId w:val="39"/>
-        </w:numPr>
-      </w:pPr>
-      <w:r>
-        <w:t>Added comments explaining header, main content, and footer.</w:t>
-      </w:r>
-    </w:p>
-    <w:p>
-      <w:pPr>
-        <w:pStyle w:val="NormalWeb"/>
-        <w:numPr>
-          <w:ilvl w:val="0"/>
-          <w:numId w:val="39"/>
-        </w:numPr>
-      </w:pPr>
-      <w:r>
-        <w:t>Standardized footer text to match other pages.</w:t>
-      </w:r>
-    </w:p>
-    <w:p>
-      <w:pPr>
-        <w:pStyle w:val="Heading2"/>
-      </w:pPr>
-      <w:r>
-        <w:rPr>
-          <w:rFonts w:ascii="Segoe UI Symbol" w:hAnsi="Segoe UI Symbol" w:cs="Segoe UI Symbol"/>
-        </w:rPr>
-        <w:t>✂</w:t>
-      </w:r>
-      <w:r>
-        <w:t>️ Services Page</w:t>
-      </w:r>
-    </w:p>
-    <w:p>
-      <w:pPr>
-        <w:pStyle w:val="NormalWeb"/>
-        <w:numPr>
-          <w:ilvl w:val="0"/>
-          <w:numId w:val="40"/>
-        </w:numPr>
-      </w:pPr>
-      <w:r>
-        <w:t xml:space="preserve">Added missing </w:t>
-      </w:r>
-      <w:r>
-        <w:rPr>
-          <w:rStyle w:val="HTMLCode"/>
-          <w:rFonts w:eastAsiaTheme="majorEastAsia"/>
-        </w:rPr>
-        <w:t>&lt;!DOCTYPE html&gt;</w:t>
-      </w:r>
-      <w:r>
-        <w:t xml:space="preserve"> declaration.</w:t>
-      </w:r>
-    </w:p>
-    <w:p>
-      <w:pPr>
-        <w:pStyle w:val="NormalWeb"/>
-        <w:numPr>
-          <w:ilvl w:val="0"/>
-          <w:numId w:val="40"/>
-        </w:numPr>
-      </w:pPr>
-      <w:r>
-        <w:t xml:space="preserve">Closed </w:t>
-      </w:r>
-      <w:r>
-        <w:rPr>
-          <w:rStyle w:val="HTMLCode"/>
-          <w:rFonts w:eastAsiaTheme="majorEastAsia"/>
-        </w:rPr>
-        <w:t>&lt;section&gt;</w:t>
-      </w:r>
-      <w:r>
-        <w:t xml:space="preserve"> tags properly (you had one left open).</w:t>
-      </w:r>
-    </w:p>
-    <w:p>
-      <w:pPr>
-        <w:pStyle w:val="NormalWeb"/>
-        <w:numPr>
-          <w:ilvl w:val="0"/>
-          <w:numId w:val="40"/>
-        </w:numPr>
-      </w:pPr>
-      <w:r>
-        <w:t>Added spacing and dashes in service prices for clarity (e.g., “Braids — R300”).</w:t>
-      </w:r>
-    </w:p>
-    <w:p>
-      <w:pPr>
-        <w:pStyle w:val="NormalWeb"/>
-        <w:numPr>
-          <w:ilvl w:val="0"/>
-          <w:numId w:val="40"/>
-        </w:numPr>
-      </w:pPr>
-      <w:r>
-        <w:t>Added comments explaining each section (Women’s services, Men’s services).</w:t>
-      </w:r>
-    </w:p>
-    <w:p>
-      <w:pPr>
-        <w:pStyle w:val="NormalWeb"/>
-        <w:numPr>
-          <w:ilvl w:val="0"/>
-          <w:numId w:val="40"/>
-        </w:numPr>
-      </w:pPr>
-      <w:r>
-        <w:t>Made navigation consistent with other pages.</w:t>
-      </w:r>
-    </w:p>
-    <w:p>
-      <w:pPr>
-        <w:pStyle w:val="Heading2"/>
-      </w:pPr>
-      <w:r>
-        <w:rPr>
-          <w:rFonts w:ascii="Segoe UI Symbol" w:hAnsi="Segoe UI Symbol" w:cs="Segoe UI Symbol"/>
-        </w:rPr>
-        <w:t>📞</w:t>
-      </w:r>
-      <w:r>
-        <w:t xml:space="preserve"> Contact Page</w:t>
-      </w:r>
-    </w:p>
-    <w:p>
-      <w:pPr>
-        <w:pStyle w:val="NormalWeb"/>
-        <w:numPr>
-          <w:ilvl w:val="0"/>
-          <w:numId w:val="41"/>
-        </w:numPr>
-      </w:pPr>
-      <w:r>
-        <w:t xml:space="preserve">Added missing </w:t>
-      </w:r>
-      <w:r>
-        <w:rPr>
-          <w:rStyle w:val="HTMLCode"/>
-          <w:rFonts w:eastAsiaTheme="majorEastAsia"/>
-        </w:rPr>
-        <w:t>&lt;!DOCTYPE html&gt;</w:t>
-      </w:r>
-      <w:r>
-        <w:t xml:space="preserve"> declaration.</w:t>
-      </w:r>
-    </w:p>
-    <w:p>
-      <w:pPr>
-        <w:pStyle w:val="NormalWeb"/>
-        <w:numPr>
-          <w:ilvl w:val="0"/>
-          <w:numId w:val="41"/>
-        </w:numPr>
-      </w:pPr>
-      <w:r>
-        <w:lastRenderedPageBreak/>
-        <w:t xml:space="preserve">Fixed unclosed </w:t>
-      </w:r>
-      <w:r>
-        <w:rPr>
-          <w:rStyle w:val="HTMLCode"/>
-          <w:rFonts w:eastAsiaTheme="majorEastAsia"/>
-        </w:rPr>
-        <w:t>&lt;p&gt;</w:t>
-      </w:r>
-      <w:r>
-        <w:t xml:space="preserve"> tag for WhatsApp line.</w:t>
-      </w:r>
-    </w:p>
-    <w:p>
-      <w:pPr>
-        <w:pStyle w:val="NormalWeb"/>
-        <w:numPr>
-          <w:ilvl w:val="0"/>
-          <w:numId w:val="41"/>
-        </w:numPr>
-      </w:pPr>
-      <w:r>
-        <w:t>Added comments explaining header, main content, and footer.</w:t>
-      </w:r>
-    </w:p>
-    <w:p>
-      <w:pPr>
-        <w:pStyle w:val="NormalWeb"/>
-        <w:numPr>
-          <w:ilvl w:val="0"/>
-          <w:numId w:val="41"/>
-        </w:numPr>
-      </w:pPr>
-      <w:r>
-        <w:t>Made navigation consistent with other pages (Home, About, Services).</w:t>
-      </w:r>
-    </w:p>
-    <w:p>
-      <w:pPr>
-        <w:pStyle w:val="NormalWeb"/>
-        <w:numPr>
-          <w:ilvl w:val="0"/>
-          <w:numId w:val="41"/>
-        </w:numPr>
-      </w:pPr>
-      <w:r>
-        <w:t>Cleaned indentation and spacing</w:t>
-      </w:r>
-    </w:p>
-    <w:p>
-      <w:pPr>
-        <w:rPr>
-          <w:sz w:val="22"/>
-          <w:szCs w:val="22"/>
-        </w:rPr>
-      </w:pPr>
-      <w:bookmarkStart w:id="0" w:name="_GoBack"/>
-      <w:bookmarkEnd w:id="0"/>
+        <w:rPr>
+          <w:sz w:val="22"/>
+          <w:szCs w:val="22"/>
+        </w:rPr>
+      </w:pPr>
     </w:p>
     <w:sectPr>
-      <w:footerReference w:type="default" r:id="rId29"/>
+      <w:footerReference w:type="default" r:id="rId19"/>
       <w:pgSz w:w="12240" w:h="15840"/>
       <w:pgMar w:top="1440" w:right="1440" w:bottom="1440" w:left="1440" w:header="720" w:footer="720" w:gutter="0"/>
       <w:pgNumType w:start="0"/>
@@ -8067,7 +5572,7 @@
 </file>
 
 <file path=word/endnotes.xml><?xml version="1.0" encoding="utf-8"?>
-<w:endnotes xmlns:wpc="http://schemas.microsoft.com/office/word/2010/wordprocessingCanvas" xmlns:mc="http://schemas.openxmlformats.org/markup-compatibility/2006" xmlns:o="urn:schemas-microsoft-com:office:office" xmlns:r="http://schemas.openxmlformats.org/officeDocument/2006/relationships" xmlns:m="http://schemas.openxmlformats.org/officeDocument/2006/math" xmlns:v="urn:schemas-microsoft-com:vml" xmlns:wp14="http://schemas.microsoft.com/office/word/2010/wordprocessingDrawing" xmlns:wp="http://schemas.openxmlformats.org/drawingml/2006/wordprocessingDrawing" xmlns:w10="urn:schemas-microsoft-com:office:word" xmlns:w="http://schemas.openxmlformats.org/wordprocessingml/2006/main" xmlns:w14="http://schemas.microsoft.com/office/word/2010/wordml" xmlns:w15="http://schemas.microsoft.com/office/word/2012/wordml" xmlns:wpg="http://schemas.microsoft.com/office/word/2010/wordprocessingGroup" xmlns:wpi="http://schemas.microsoft.com/office/word/2010/wordprocessingInk" xmlns:wne="http://schemas.microsoft.com/office/word/2006/wordml" xmlns:wps="http://schemas.microsoft.com/office/word/2010/wordprocessingShape" mc:Ignorable="w14 w15 wp14">
+<w:endnotes xmlns:wpc="http://schemas.microsoft.com/office/word/2010/wordprocessingCanvas" xmlns:cx="http://schemas.microsoft.com/office/drawing/2014/chartex" xmlns:cx1="http://schemas.microsoft.com/office/drawing/2015/9/8/chartex" xmlns:cx2="http://schemas.microsoft.com/office/drawing/2015/10/21/chartex" xmlns:cx3="http://schemas.microsoft.com/office/drawing/2016/5/9/chartex" xmlns:cx4="http://schemas.microsoft.com/office/drawing/2016/5/10/chartex" xmlns:cx5="http://schemas.microsoft.com/office/drawing/2016/5/11/chartex" xmlns:cx6="http://schemas.microsoft.com/office/drawing/2016/5/12/chartex" xmlns:cx7="http://schemas.microsoft.com/office/drawing/2016/5/13/chartex" xmlns:cx8="http://schemas.microsoft.com/office/drawing/2016/5/14/chartex" xmlns:mc="http://schemas.openxmlformats.org/markup-compatibility/2006" xmlns:aink="http://schemas.microsoft.com/office/drawing/2016/ink" xmlns:am3d="http://schemas.microsoft.com/office/drawing/2017/model3d" xmlns:o="urn:schemas-microsoft-com:office:office" xmlns:oel="http://schemas.microsoft.com/office/2019/extlst" xmlns:r="http://schemas.openxmlformats.org/officeDocument/2006/relationships" xmlns:m="http://schemas.openxmlformats.org/officeDocument/2006/math" xmlns:v="urn:schemas-microsoft-com:vml" xmlns:wp14="http://schemas.microsoft.com/office/word/2010/wordprocessingDrawing" xmlns:wp="http://schemas.openxmlformats.org/drawingml/2006/wordprocessingDrawing" xmlns:w10="urn:schemas-microsoft-com:office:word" xmlns:w="http://schemas.openxmlformats.org/wordprocessingml/2006/main" xmlns:w14="http://schemas.microsoft.com/office/word/2010/wordml" xmlns:w15="http://schemas.microsoft.com/office/word/2012/wordml" xmlns:w16cex="http://schemas.microsoft.com/office/word/2018/wordml/cex" xmlns:w16cid="http://schemas.microsoft.com/office/word/2016/wordml/cid" xmlns:w16="http://schemas.microsoft.com/office/word/2018/wordml" xmlns:w16du="http://schemas.microsoft.com/office/word/2023/wordml/word16du" xmlns:w16sdtdh="http://schemas.microsoft.com/office/word/2020/wordml/sdtdatahash" xmlns:w16sdtfl="http://schemas.microsoft.com/office/word/2024/wordml/sdtformatlock" xmlns:w16se="http://schemas.microsoft.com/office/word/2015/wordml/symex" xmlns:wpg="http://schemas.microsoft.com/office/word/2010/wordprocessingGroup" xmlns:wpi="http://schemas.microsoft.com/office/word/2010/wordprocessingInk" xmlns:wne="http://schemas.microsoft.com/office/word/2006/wordml" xmlns:wps="http://schemas.microsoft.com/office/word/2010/wordprocessingShape" mc:Ignorable="w14 w15 w16se w16cid w16 w16cex w16sdtdh w16sdtfl w16du wp14">
   <w:endnote w:type="separator" w:id="-1">
     <w:p>
       <w:pPr>
@@ -8092,7 +5597,7 @@
 </file>
 
 <file path=word/footer1.xml><?xml version="1.0" encoding="utf-8"?>
-<w:ftr xmlns:wpc="http://schemas.microsoft.com/office/word/2010/wordprocessingCanvas" xmlns:mc="http://schemas.openxmlformats.org/markup-compatibility/2006" xmlns:o="urn:schemas-microsoft-com:office:office" xmlns:r="http://schemas.openxmlformats.org/officeDocument/2006/relationships" xmlns:m="http://schemas.openxmlformats.org/officeDocument/2006/math" xmlns:v="urn:schemas-microsoft-com:vml" xmlns:wp14="http://schemas.microsoft.com/office/word/2010/wordprocessingDrawing" xmlns:wp="http://schemas.openxmlformats.org/drawingml/2006/wordprocessingDrawing" xmlns:w10="urn:schemas-microsoft-com:office:word" xmlns:w="http://schemas.openxmlformats.org/wordprocessingml/2006/main" xmlns:w14="http://schemas.microsoft.com/office/word/2010/wordml" xmlns:w15="http://schemas.microsoft.com/office/word/2012/wordml" xmlns:wpg="http://schemas.microsoft.com/office/word/2010/wordprocessingGroup" xmlns:wpi="http://schemas.microsoft.com/office/word/2010/wordprocessingInk" xmlns:wne="http://schemas.microsoft.com/office/word/2006/wordml" xmlns:wps="http://schemas.microsoft.com/office/word/2010/wordprocessingShape" mc:Ignorable="w14 w15 wp14">
+<w:ftr xmlns:wpc="http://schemas.microsoft.com/office/word/2010/wordprocessingCanvas" xmlns:cx="http://schemas.microsoft.com/office/drawing/2014/chartex" xmlns:cx1="http://schemas.microsoft.com/office/drawing/2015/9/8/chartex" xmlns:cx2="http://schemas.microsoft.com/office/drawing/2015/10/21/chartex" xmlns:cx3="http://schemas.microsoft.com/office/drawing/2016/5/9/chartex" xmlns:cx4="http://schemas.microsoft.com/office/drawing/2016/5/10/chartex" xmlns:cx5="http://schemas.microsoft.com/office/drawing/2016/5/11/chartex" xmlns:cx6="http://schemas.microsoft.com/office/drawing/2016/5/12/chartex" xmlns:cx7="http://schemas.microsoft.com/office/drawing/2016/5/13/chartex" xmlns:cx8="http://schemas.microsoft.com/office/drawing/2016/5/14/chartex" xmlns:mc="http://schemas.openxmlformats.org/markup-compatibility/2006" xmlns:aink="http://schemas.microsoft.com/office/drawing/2016/ink" xmlns:am3d="http://schemas.microsoft.com/office/drawing/2017/model3d" xmlns:o="urn:schemas-microsoft-com:office:office" xmlns:oel="http://schemas.microsoft.com/office/2019/extlst" xmlns:r="http://schemas.openxmlformats.org/officeDocument/2006/relationships" xmlns:m="http://schemas.openxmlformats.org/officeDocument/2006/math" xmlns:v="urn:schemas-microsoft-com:vml" xmlns:wp14="http://schemas.microsoft.com/office/word/2010/wordprocessingDrawing" xmlns:wp="http://schemas.openxmlformats.org/drawingml/2006/wordprocessingDrawing" xmlns:w10="urn:schemas-microsoft-com:office:word" xmlns:w="http://schemas.openxmlformats.org/wordprocessingml/2006/main" xmlns:w14="http://schemas.microsoft.com/office/word/2010/wordml" xmlns:w15="http://schemas.microsoft.com/office/word/2012/wordml" xmlns:w16cex="http://schemas.microsoft.com/office/word/2018/wordml/cex" xmlns:w16cid="http://schemas.microsoft.com/office/word/2016/wordml/cid" xmlns:w16="http://schemas.microsoft.com/office/word/2018/wordml" xmlns:w16du="http://schemas.microsoft.com/office/word/2023/wordml/word16du" xmlns:w16sdtdh="http://schemas.microsoft.com/office/word/2020/wordml/sdtdatahash" xmlns:w16sdtfl="http://schemas.microsoft.com/office/word/2024/wordml/sdtformatlock" xmlns:w16se="http://schemas.microsoft.com/office/word/2015/wordml/symex" xmlns:wpg="http://schemas.microsoft.com/office/word/2010/wordprocessingGroup" xmlns:wpi="http://schemas.microsoft.com/office/word/2010/wordprocessingInk" xmlns:wne="http://schemas.microsoft.com/office/word/2006/wordml" xmlns:wps="http://schemas.microsoft.com/office/word/2010/wordprocessingShape" mc:Ignorable="w14 w15 w16se w16cid w16 w16cex w16sdtdh w16sdtfl w16du wp14">
   <w:sdt>
     <w:sdtPr>
       <w:id w:val="1671213233"/>
@@ -8145,7 +5650,7 @@
 </file>
 
 <file path=word/footnotes.xml><?xml version="1.0" encoding="utf-8"?>
-<w:footnotes xmlns:wpc="http://schemas.microsoft.com/office/word/2010/wordprocessingCanvas" xmlns:mc="http://schemas.openxmlformats.org/markup-compatibility/2006" xmlns:o="urn:schemas-microsoft-com:office:office" xmlns:r="http://schemas.openxmlformats.org/officeDocument/2006/relationships" xmlns:m="http://schemas.openxmlformats.org/officeDocument/2006/math" xmlns:v="urn:schemas-microsoft-com:vml" xmlns:wp14="http://schemas.microsoft.com/office/word/2010/wordprocessingDrawing" xmlns:wp="http://schemas.openxmlformats.org/drawingml/2006/wordprocessingDrawing" xmlns:w10="urn:schemas-microsoft-com:office:word" xmlns:w="http://schemas.openxmlformats.org/wordprocessingml/2006/main" xmlns:w14="http://schemas.microsoft.com/office/word/2010/wordml" xmlns:w15="http://schemas.microsoft.com/office/word/2012/wordml" xmlns:wpg="http://schemas.microsoft.com/office/word/2010/wordprocessingGroup" xmlns:wpi="http://schemas.microsoft.com/office/word/2010/wordprocessingInk" xmlns:wne="http://schemas.microsoft.com/office/word/2006/wordml" xmlns:wps="http://schemas.microsoft.com/office/word/2010/wordprocessingShape" mc:Ignorable="w14 w15 wp14">
+<w:footnotes xmlns:wpc="http://schemas.microsoft.com/office/word/2010/wordprocessingCanvas" xmlns:cx="http://schemas.microsoft.com/office/drawing/2014/chartex" xmlns:cx1="http://schemas.microsoft.com/office/drawing/2015/9/8/chartex" xmlns:cx2="http://schemas.microsoft.com/office/drawing/2015/10/21/chartex" xmlns:cx3="http://schemas.microsoft.com/office/drawing/2016/5/9/chartex" xmlns:cx4="http://schemas.microsoft.com/office/drawing/2016/5/10/chartex" xmlns:cx5="http://schemas.microsoft.com/office/drawing/2016/5/11/chartex" xmlns:cx6="http://schemas.microsoft.com/office/drawing/2016/5/12/chartex" xmlns:cx7="http://schemas.microsoft.com/office/drawing/2016/5/13/chartex" xmlns:cx8="http://schemas.microsoft.com/office/drawing/2016/5/14/chartex" xmlns:mc="http://schemas.openxmlformats.org/markup-compatibility/2006" xmlns:aink="http://schemas.microsoft.com/office/drawing/2016/ink" xmlns:am3d="http://schemas.microsoft.com/office/drawing/2017/model3d" xmlns:o="urn:schemas-microsoft-com:office:office" xmlns:oel="http://schemas.microsoft.com/office/2019/extlst" xmlns:r="http://schemas.openxmlformats.org/officeDocument/2006/relationships" xmlns:m="http://schemas.openxmlformats.org/officeDocument/2006/math" xmlns:v="urn:schemas-microsoft-com:vml" xmlns:wp14="http://schemas.microsoft.com/office/word/2010/wordprocessingDrawing" xmlns:wp="http://schemas.openxmlformats.org/drawingml/2006/wordprocessingDrawing" xmlns:w10="urn:schemas-microsoft-com:office:word" xmlns:w="http://schemas.openxmlformats.org/wordprocessingml/2006/main" xmlns:w14="http://schemas.microsoft.com/office/word/2010/wordml" xmlns:w15="http://schemas.microsoft.com/office/word/2012/wordml" xmlns:w16cex="http://schemas.microsoft.com/office/word/2018/wordml/cex" xmlns:w16cid="http://schemas.microsoft.com/office/word/2016/wordml/cid" xmlns:w16="http://schemas.microsoft.com/office/word/2018/wordml" xmlns:w16du="http://schemas.microsoft.com/office/word/2023/wordml/word16du" xmlns:w16sdtdh="http://schemas.microsoft.com/office/word/2020/wordml/sdtdatahash" xmlns:w16sdtfl="http://schemas.microsoft.com/office/word/2024/wordml/sdtformatlock" xmlns:w16se="http://schemas.microsoft.com/office/word/2015/wordml/symex" xmlns:wpg="http://schemas.microsoft.com/office/word/2010/wordprocessingGroup" xmlns:wpi="http://schemas.microsoft.com/office/word/2010/wordprocessingInk" xmlns:wne="http://schemas.microsoft.com/office/word/2006/wordml" xmlns:wps="http://schemas.microsoft.com/office/word/2010/wordprocessingShape" mc:Ignorable="w14 w15 w16se w16cid w16 w16cex w16sdtdh w16sdtfl w16du wp14">
   <w:footnote w:type="separator" w:id="-1">
     <w:p>
       <w:pPr>
@@ -8170,8 +5675,8 @@
 </file>
 
 <file path=word/numbering.xml><?xml version="1.0" encoding="utf-8"?>
-<w:numbering xmlns:wpc="http://schemas.microsoft.com/office/word/2010/wordprocessingCanvas" xmlns:mc="http://schemas.openxmlformats.org/markup-compatibility/2006" xmlns:o="urn:schemas-microsoft-com:office:office" xmlns:r="http://schemas.openxmlformats.org/officeDocument/2006/relationships" xmlns:m="http://schemas.openxmlformats.org/officeDocument/2006/math" xmlns:v="urn:schemas-microsoft-com:vml" xmlns:wp14="http://schemas.microsoft.com/office/word/2010/wordprocessingDrawing" xmlns:wp="http://schemas.openxmlformats.org/drawingml/2006/wordprocessingDrawing" xmlns:w10="urn:schemas-microsoft-com:office:word" xmlns:w="http://schemas.openxmlformats.org/wordprocessingml/2006/main" xmlns:w14="http://schemas.microsoft.com/office/word/2010/wordml" xmlns:w15="http://schemas.microsoft.com/office/word/2012/wordml" xmlns:wpg="http://schemas.microsoft.com/office/word/2010/wordprocessingGroup" xmlns:wpi="http://schemas.microsoft.com/office/word/2010/wordprocessingInk" xmlns:wne="http://schemas.microsoft.com/office/word/2006/wordml" xmlns:wps="http://schemas.microsoft.com/office/word/2010/wordprocessingShape" mc:Ignorable="w14 w15 wp14">
-  <w:abstractNum w:abstractNumId="0">
+<w:numbering xmlns:wpc="http://schemas.microsoft.com/office/word/2010/wordprocessingCanvas" xmlns:cx="http://schemas.microsoft.com/office/drawing/2014/chartex" xmlns:cx1="http://schemas.microsoft.com/office/drawing/2015/9/8/chartex" xmlns:cx2="http://schemas.microsoft.com/office/drawing/2015/10/21/chartex" xmlns:cx3="http://schemas.microsoft.com/office/drawing/2016/5/9/chartex" xmlns:cx4="http://schemas.microsoft.com/office/drawing/2016/5/10/chartex" xmlns:cx5="http://schemas.microsoft.com/office/drawing/2016/5/11/chartex" xmlns:cx6="http://schemas.microsoft.com/office/drawing/2016/5/12/chartex" xmlns:cx7="http://schemas.microsoft.com/office/drawing/2016/5/13/chartex" xmlns:cx8="http://schemas.microsoft.com/office/drawing/2016/5/14/chartex" xmlns:mc="http://schemas.openxmlformats.org/markup-compatibility/2006" xmlns:aink="http://schemas.microsoft.com/office/drawing/2016/ink" xmlns:am3d="http://schemas.microsoft.com/office/drawing/2017/model3d" xmlns:o="urn:schemas-microsoft-com:office:office" xmlns:oel="http://schemas.microsoft.com/office/2019/extlst" xmlns:r="http://schemas.openxmlformats.org/officeDocument/2006/relationships" xmlns:m="http://schemas.openxmlformats.org/officeDocument/2006/math" xmlns:v="urn:schemas-microsoft-com:vml" xmlns:wp14="http://schemas.microsoft.com/office/word/2010/wordprocessingDrawing" xmlns:wp="http://schemas.openxmlformats.org/drawingml/2006/wordprocessingDrawing" xmlns:w10="urn:schemas-microsoft-com:office:word" xmlns:w="http://schemas.openxmlformats.org/wordprocessingml/2006/main" xmlns:w14="http://schemas.microsoft.com/office/word/2010/wordml" xmlns:w15="http://schemas.microsoft.com/office/word/2012/wordml" xmlns:w16cex="http://schemas.microsoft.com/office/word/2018/wordml/cex" xmlns:w16cid="http://schemas.microsoft.com/office/word/2016/wordml/cid" xmlns:w16="http://schemas.microsoft.com/office/word/2018/wordml" xmlns:w16du="http://schemas.microsoft.com/office/word/2023/wordml/word16du" xmlns:w16sdtdh="http://schemas.microsoft.com/office/word/2020/wordml/sdtdatahash" xmlns:w16sdtfl="http://schemas.microsoft.com/office/word/2024/wordml/sdtformatlock" xmlns:w16se="http://schemas.microsoft.com/office/word/2015/wordml/symex" xmlns:wpg="http://schemas.microsoft.com/office/word/2010/wordprocessingGroup" xmlns:wpi="http://schemas.microsoft.com/office/word/2010/wordprocessingInk" xmlns:wne="http://schemas.microsoft.com/office/word/2006/wordml" xmlns:wps="http://schemas.microsoft.com/office/word/2010/wordprocessingShape" mc:Ignorable="w14 w15 w16se w16cid w16 w16cex w16sdtdh w16sdtfl w16du wp14">
+  <w:abstractNum w:abstractNumId="0" w15:restartNumberingAfterBreak="0">
     <w:nsid w:val="02496A6F"/>
     <w:multiLevelType w:val="multilevel"/>
     <w:tmpl w:val="DEF88AF2"/>
@@ -8320,7 +5825,7 @@
       </w:rPr>
     </w:lvl>
   </w:abstractNum>
-  <w:abstractNum w:abstractNumId="1">
+  <w:abstractNum w:abstractNumId="1" w15:restartNumberingAfterBreak="0">
     <w:nsid w:val="06D13F8A"/>
     <w:multiLevelType w:val="multilevel"/>
     <w:tmpl w:val="8640B5FE"/>
@@ -8469,7 +5974,7 @@
       </w:rPr>
     </w:lvl>
   </w:abstractNum>
-  <w:abstractNum w:abstractNumId="2">
+  <w:abstractNum w:abstractNumId="2" w15:restartNumberingAfterBreak="0">
     <w:nsid w:val="088744D1"/>
     <w:multiLevelType w:val="multilevel"/>
     <w:tmpl w:val="96FA822A"/>
@@ -8618,7 +6123,7 @@
       </w:rPr>
     </w:lvl>
   </w:abstractNum>
-  <w:abstractNum w:abstractNumId="3">
+  <w:abstractNum w:abstractNumId="3" w15:restartNumberingAfterBreak="0">
     <w:nsid w:val="0DC15A3C"/>
     <w:multiLevelType w:val="multilevel"/>
     <w:tmpl w:val="DE0ACA66"/>
@@ -8767,7 +6272,7 @@
       </w:rPr>
     </w:lvl>
   </w:abstractNum>
-  <w:abstractNum w:abstractNumId="4">
+  <w:abstractNum w:abstractNumId="4" w15:restartNumberingAfterBreak="0">
     <w:nsid w:val="157A1E46"/>
     <w:multiLevelType w:val="multilevel"/>
     <w:tmpl w:val="5254EC56"/>
@@ -8916,7 +6421,7 @@
       </w:rPr>
     </w:lvl>
   </w:abstractNum>
-  <w:abstractNum w:abstractNumId="5">
+  <w:abstractNum w:abstractNumId="5" w15:restartNumberingAfterBreak="0">
     <w:nsid w:val="16253392"/>
     <w:multiLevelType w:val="multilevel"/>
     <w:tmpl w:val="6CFC9BEC"/>
@@ -9065,7 +6570,7 @@
       </w:rPr>
     </w:lvl>
   </w:abstractNum>
-  <w:abstractNum w:abstractNumId="6">
+  <w:abstractNum w:abstractNumId="6" w15:restartNumberingAfterBreak="0">
     <w:nsid w:val="17F704A6"/>
     <w:multiLevelType w:val="multilevel"/>
     <w:tmpl w:val="0D90B0AA"/>
@@ -9214,7 +6719,7 @@
       </w:rPr>
     </w:lvl>
   </w:abstractNum>
-  <w:abstractNum w:abstractNumId="7">
+  <w:abstractNum w:abstractNumId="7" w15:restartNumberingAfterBreak="0">
     <w:nsid w:val="21ED355A"/>
     <w:multiLevelType w:val="multilevel"/>
     <w:tmpl w:val="10D2BF54"/>
@@ -9363,7 +6868,7 @@
       </w:rPr>
     </w:lvl>
   </w:abstractNum>
-  <w:abstractNum w:abstractNumId="8">
+  <w:abstractNum w:abstractNumId="8" w15:restartNumberingAfterBreak="0">
     <w:nsid w:val="28A46685"/>
     <w:multiLevelType w:val="multilevel"/>
     <w:tmpl w:val="9368A788"/>
@@ -9512,7 +7017,7 @@
       </w:rPr>
     </w:lvl>
   </w:abstractNum>
-  <w:abstractNum w:abstractNumId="9">
+  <w:abstractNum w:abstractNumId="9" w15:restartNumberingAfterBreak="0">
     <w:nsid w:val="2BEC297B"/>
     <w:multiLevelType w:val="multilevel"/>
     <w:tmpl w:val="3F282D3A"/>
@@ -9661,7 +7166,7 @@
       </w:rPr>
     </w:lvl>
   </w:abstractNum>
-  <w:abstractNum w:abstractNumId="10">
+  <w:abstractNum w:abstractNumId="10" w15:restartNumberingAfterBreak="0">
     <w:nsid w:val="303943F0"/>
     <w:multiLevelType w:val="multilevel"/>
     <w:tmpl w:val="3B325FE8"/>
@@ -9810,7 +7315,7 @@
       </w:rPr>
     </w:lvl>
   </w:abstractNum>
-  <w:abstractNum w:abstractNumId="11">
+  <w:abstractNum w:abstractNumId="11" w15:restartNumberingAfterBreak="0">
     <w:nsid w:val="32E079A2"/>
     <w:multiLevelType w:val="multilevel"/>
     <w:tmpl w:val="163EA46A"/>
@@ -9959,7 +7464,7 @@
       </w:rPr>
     </w:lvl>
   </w:abstractNum>
-  <w:abstractNum w:abstractNumId="12">
+  <w:abstractNum w:abstractNumId="12" w15:restartNumberingAfterBreak="0">
     <w:nsid w:val="333B1419"/>
     <w:multiLevelType w:val="multilevel"/>
     <w:tmpl w:val="78CA6D42"/>
@@ -10108,7 +7613,7 @@
       </w:rPr>
     </w:lvl>
   </w:abstractNum>
-  <w:abstractNum w:abstractNumId="13">
+  <w:abstractNum w:abstractNumId="13" w15:restartNumberingAfterBreak="0">
     <w:nsid w:val="34EB68DA"/>
     <w:multiLevelType w:val="multilevel"/>
     <w:tmpl w:val="6D7EEF7A"/>
@@ -10257,7 +7762,7 @@
       </w:rPr>
     </w:lvl>
   </w:abstractNum>
-  <w:abstractNum w:abstractNumId="14">
+  <w:abstractNum w:abstractNumId="14" w15:restartNumberingAfterBreak="0">
     <w:nsid w:val="36C42B55"/>
     <w:multiLevelType w:val="multilevel"/>
     <w:tmpl w:val="4ED6D140"/>
@@ -10406,7 +7911,7 @@
       </w:rPr>
     </w:lvl>
   </w:abstractNum>
-  <w:abstractNum w:abstractNumId="15">
+  <w:abstractNum w:abstractNumId="15" w15:restartNumberingAfterBreak="0">
     <w:nsid w:val="371A1225"/>
     <w:multiLevelType w:val="multilevel"/>
     <w:tmpl w:val="6FC67508"/>
@@ -10555,7 +8060,7 @@
       </w:rPr>
     </w:lvl>
   </w:abstractNum>
-  <w:abstractNum w:abstractNumId="16">
+  <w:abstractNum w:abstractNumId="16" w15:restartNumberingAfterBreak="0">
     <w:nsid w:val="378D49E9"/>
     <w:multiLevelType w:val="multilevel"/>
     <w:tmpl w:val="5748E0D4"/>
@@ -10704,7 +8209,7 @@
       </w:rPr>
     </w:lvl>
   </w:abstractNum>
-  <w:abstractNum w:abstractNumId="17">
+  <w:abstractNum w:abstractNumId="17" w15:restartNumberingAfterBreak="0">
     <w:nsid w:val="390F3294"/>
     <w:multiLevelType w:val="multilevel"/>
     <w:tmpl w:val="12604CAA"/>
@@ -10853,7 +8358,7 @@
       </w:rPr>
     </w:lvl>
   </w:abstractNum>
-  <w:abstractNum w:abstractNumId="18">
+  <w:abstractNum w:abstractNumId="18" w15:restartNumberingAfterBreak="0">
     <w:nsid w:val="3DF34562"/>
     <w:multiLevelType w:val="multilevel"/>
     <w:tmpl w:val="256AC7DC"/>
@@ -11002,7 +8507,7 @@
       </w:rPr>
     </w:lvl>
   </w:abstractNum>
-  <w:abstractNum w:abstractNumId="19">
+  <w:abstractNum w:abstractNumId="19" w15:restartNumberingAfterBreak="0">
     <w:nsid w:val="3EF20FB7"/>
     <w:multiLevelType w:val="multilevel"/>
     <w:tmpl w:val="38DEF2F2"/>
@@ -11151,7 +8656,7 @@
       </w:rPr>
     </w:lvl>
   </w:abstractNum>
-  <w:abstractNum w:abstractNumId="20">
+  <w:abstractNum w:abstractNumId="20" w15:restartNumberingAfterBreak="0">
     <w:nsid w:val="3FF01102"/>
     <w:multiLevelType w:val="multilevel"/>
     <w:tmpl w:val="66E6E28E"/>
@@ -11300,7 +8805,7 @@
       </w:rPr>
     </w:lvl>
   </w:abstractNum>
-  <w:abstractNum w:abstractNumId="21">
+  <w:abstractNum w:abstractNumId="21" w15:restartNumberingAfterBreak="0">
     <w:nsid w:val="406F1463"/>
     <w:multiLevelType w:val="multilevel"/>
     <w:tmpl w:val="BFD4CED6"/>
@@ -11449,7 +8954,7 @@
       </w:rPr>
     </w:lvl>
   </w:abstractNum>
-  <w:abstractNum w:abstractNumId="22">
+  <w:abstractNum w:abstractNumId="22" w15:restartNumberingAfterBreak="0">
     <w:nsid w:val="40717067"/>
     <w:multiLevelType w:val="multilevel"/>
     <w:tmpl w:val="D820E302"/>
@@ -11598,7 +9103,7 @@
       </w:rPr>
     </w:lvl>
   </w:abstractNum>
-  <w:abstractNum w:abstractNumId="23">
+  <w:abstractNum w:abstractNumId="23" w15:restartNumberingAfterBreak="0">
     <w:nsid w:val="47A7286D"/>
     <w:multiLevelType w:val="multilevel"/>
     <w:tmpl w:val="30349624"/>
@@ -11747,7 +9252,7 @@
       </w:rPr>
     </w:lvl>
   </w:abstractNum>
-  <w:abstractNum w:abstractNumId="24">
+  <w:abstractNum w:abstractNumId="24" w15:restartNumberingAfterBreak="0">
     <w:nsid w:val="4D0D2093"/>
     <w:multiLevelType w:val="multilevel"/>
     <w:tmpl w:val="BA82B32C"/>
@@ -11896,7 +9401,7 @@
       </w:rPr>
     </w:lvl>
   </w:abstractNum>
-  <w:abstractNum w:abstractNumId="25">
+  <w:abstractNum w:abstractNumId="25" w15:restartNumberingAfterBreak="0">
     <w:nsid w:val="507C7036"/>
     <w:multiLevelType w:val="multilevel"/>
     <w:tmpl w:val="4B4AD044"/>
@@ -12045,7 +9550,7 @@
       </w:rPr>
     </w:lvl>
   </w:abstractNum>
-  <w:abstractNum w:abstractNumId="26">
+  <w:abstractNum w:abstractNumId="26" w15:restartNumberingAfterBreak="0">
     <w:nsid w:val="552657BC"/>
     <w:multiLevelType w:val="multilevel"/>
     <w:tmpl w:val="40AEDA16"/>
@@ -12194,7 +9699,7 @@
       </w:rPr>
     </w:lvl>
   </w:abstractNum>
-  <w:abstractNum w:abstractNumId="27">
+  <w:abstractNum w:abstractNumId="27" w15:restartNumberingAfterBreak="0">
     <w:nsid w:val="58546299"/>
     <w:multiLevelType w:val="multilevel"/>
     <w:tmpl w:val="C46610D8"/>
@@ -12343,7 +9848,7 @@
       </w:rPr>
     </w:lvl>
   </w:abstractNum>
-  <w:abstractNum w:abstractNumId="28">
+  <w:abstractNum w:abstractNumId="28" w15:restartNumberingAfterBreak="0">
     <w:nsid w:val="5EF93220"/>
     <w:multiLevelType w:val="multilevel"/>
     <w:tmpl w:val="4934AEAE"/>
@@ -12492,7 +9997,7 @@
       </w:rPr>
     </w:lvl>
   </w:abstractNum>
-  <w:abstractNum w:abstractNumId="29">
+  <w:abstractNum w:abstractNumId="29" w15:restartNumberingAfterBreak="0">
     <w:nsid w:val="608A4C41"/>
     <w:multiLevelType w:val="multilevel"/>
     <w:tmpl w:val="2F2E6B9C"/>
@@ -12641,7 +10146,7 @@
       </w:rPr>
     </w:lvl>
   </w:abstractNum>
-  <w:abstractNum w:abstractNumId="30">
+  <w:abstractNum w:abstractNumId="30" w15:restartNumberingAfterBreak="0">
     <w:nsid w:val="617C1D69"/>
     <w:multiLevelType w:val="multilevel"/>
     <w:tmpl w:val="0D7252B6"/>
@@ -12790,7 +10295,7 @@
       </w:rPr>
     </w:lvl>
   </w:abstractNum>
-  <w:abstractNum w:abstractNumId="31">
+  <w:abstractNum w:abstractNumId="31" w15:restartNumberingAfterBreak="0">
     <w:nsid w:val="6F19639F"/>
     <w:multiLevelType w:val="multilevel"/>
     <w:tmpl w:val="14A8F890"/>
@@ -12939,7 +10444,7 @@
       </w:rPr>
     </w:lvl>
   </w:abstractNum>
-  <w:abstractNum w:abstractNumId="32">
+  <w:abstractNum w:abstractNumId="32" w15:restartNumberingAfterBreak="0">
     <w:nsid w:val="73723759"/>
     <w:multiLevelType w:val="multilevel"/>
     <w:tmpl w:val="2C341E4A"/>
@@ -13088,7 +10593,7 @@
       </w:rPr>
     </w:lvl>
   </w:abstractNum>
-  <w:abstractNum w:abstractNumId="33">
+  <w:abstractNum w:abstractNumId="33" w15:restartNumberingAfterBreak="0">
     <w:nsid w:val="742E512D"/>
     <w:multiLevelType w:val="multilevel"/>
     <w:tmpl w:val="C334223A"/>
@@ -13237,7 +10742,7 @@
       </w:rPr>
     </w:lvl>
   </w:abstractNum>
-  <w:abstractNum w:abstractNumId="34">
+  <w:abstractNum w:abstractNumId="34" w15:restartNumberingAfterBreak="0">
     <w:nsid w:val="752D2138"/>
     <w:multiLevelType w:val="multilevel"/>
     <w:tmpl w:val="10F008C2"/>
@@ -13386,7 +10891,7 @@
       </w:rPr>
     </w:lvl>
   </w:abstractNum>
-  <w:abstractNum w:abstractNumId="35">
+  <w:abstractNum w:abstractNumId="35" w15:restartNumberingAfterBreak="0">
     <w:nsid w:val="75841CCC"/>
     <w:multiLevelType w:val="multilevel"/>
     <w:tmpl w:val="C3E00F6C"/>
@@ -13535,7 +11040,7 @@
       </w:rPr>
     </w:lvl>
   </w:abstractNum>
-  <w:abstractNum w:abstractNumId="36">
+  <w:abstractNum w:abstractNumId="36" w15:restartNumberingAfterBreak="0">
     <w:nsid w:val="765A19BB"/>
     <w:multiLevelType w:val="multilevel"/>
     <w:tmpl w:val="876263F2"/>
@@ -13684,7 +11189,7 @@
       </w:rPr>
     </w:lvl>
   </w:abstractNum>
-  <w:abstractNum w:abstractNumId="37">
+  <w:abstractNum w:abstractNumId="37" w15:restartNumberingAfterBreak="0">
     <w:nsid w:val="768E796C"/>
     <w:multiLevelType w:val="multilevel"/>
     <w:tmpl w:val="E4CCE0D0"/>
@@ -13833,7 +11338,7 @@
       </w:rPr>
     </w:lvl>
   </w:abstractNum>
-  <w:abstractNum w:abstractNumId="38">
+  <w:abstractNum w:abstractNumId="38" w15:restartNumberingAfterBreak="0">
     <w:nsid w:val="795C1A39"/>
     <w:multiLevelType w:val="multilevel"/>
     <w:tmpl w:val="4E044860"/>
@@ -13982,7 +11487,7 @@
       </w:rPr>
     </w:lvl>
   </w:abstractNum>
-  <w:abstractNum w:abstractNumId="39">
+  <w:abstractNum w:abstractNumId="39" w15:restartNumberingAfterBreak="0">
     <w:nsid w:val="7C592B1E"/>
     <w:multiLevelType w:val="multilevel"/>
     <w:tmpl w:val="ABE4DE4A"/>
@@ -14131,7 +11636,7 @@
       </w:rPr>
     </w:lvl>
   </w:abstractNum>
-  <w:abstractNum w:abstractNumId="40">
+  <w:abstractNum w:abstractNumId="40" w15:restartNumberingAfterBreak="0">
     <w:nsid w:val="7F5124CC"/>
     <w:multiLevelType w:val="multilevel"/>
     <w:tmpl w:val="C9263DEC"/>
@@ -14280,134 +11785,134 @@
       </w:rPr>
     </w:lvl>
   </w:abstractNum>
-  <w:num w:numId="1">
+  <w:num w:numId="1" w16cid:durableId="703284244">
     <w:abstractNumId w:val="30"/>
   </w:num>
-  <w:num w:numId="2">
+  <w:num w:numId="2" w16cid:durableId="493644336">
     <w:abstractNumId w:val="0"/>
   </w:num>
-  <w:num w:numId="3">
+  <w:num w:numId="3" w16cid:durableId="804929117">
     <w:abstractNumId w:val="17"/>
   </w:num>
-  <w:num w:numId="4">
+  <w:num w:numId="4" w16cid:durableId="122424746">
     <w:abstractNumId w:val="26"/>
   </w:num>
-  <w:num w:numId="5">
+  <w:num w:numId="5" w16cid:durableId="305168125">
     <w:abstractNumId w:val="6"/>
   </w:num>
-  <w:num w:numId="6">
+  <w:num w:numId="6" w16cid:durableId="790319209">
     <w:abstractNumId w:val="25"/>
   </w:num>
-  <w:num w:numId="7">
+  <w:num w:numId="7" w16cid:durableId="327439507">
     <w:abstractNumId w:val="16"/>
   </w:num>
-  <w:num w:numId="8">
+  <w:num w:numId="8" w16cid:durableId="593129759">
     <w:abstractNumId w:val="20"/>
   </w:num>
-  <w:num w:numId="9">
+  <w:num w:numId="9" w16cid:durableId="1805930675">
     <w:abstractNumId w:val="1"/>
   </w:num>
-  <w:num w:numId="10">
+  <w:num w:numId="10" w16cid:durableId="2076079014">
     <w:abstractNumId w:val="35"/>
   </w:num>
-  <w:num w:numId="11">
+  <w:num w:numId="11" w16cid:durableId="49305036">
     <w:abstractNumId w:val="37"/>
   </w:num>
-  <w:num w:numId="12">
+  <w:num w:numId="12" w16cid:durableId="217590745">
     <w:abstractNumId w:val="40"/>
   </w:num>
-  <w:num w:numId="13">
+  <w:num w:numId="13" w16cid:durableId="794370867">
     <w:abstractNumId w:val="32"/>
   </w:num>
-  <w:num w:numId="14">
+  <w:num w:numId="14" w16cid:durableId="701789964">
     <w:abstractNumId w:val="18"/>
   </w:num>
-  <w:num w:numId="15">
+  <w:num w:numId="15" w16cid:durableId="763838964">
     <w:abstractNumId w:val="38"/>
   </w:num>
-  <w:num w:numId="16">
+  <w:num w:numId="16" w16cid:durableId="596016775">
     <w:abstractNumId w:val="2"/>
   </w:num>
-  <w:num w:numId="17">
+  <w:num w:numId="17" w16cid:durableId="788669724">
     <w:abstractNumId w:val="36"/>
   </w:num>
-  <w:num w:numId="18">
+  <w:num w:numId="18" w16cid:durableId="1358387560">
     <w:abstractNumId w:val="28"/>
   </w:num>
-  <w:num w:numId="19">
+  <w:num w:numId="19" w16cid:durableId="1885630671">
     <w:abstractNumId w:val="34"/>
   </w:num>
-  <w:num w:numId="20">
+  <w:num w:numId="20" w16cid:durableId="361831139">
     <w:abstractNumId w:val="15"/>
   </w:num>
-  <w:num w:numId="21">
+  <w:num w:numId="21" w16cid:durableId="1742824158">
     <w:abstractNumId w:val="5"/>
   </w:num>
-  <w:num w:numId="22">
+  <w:num w:numId="22" w16cid:durableId="598946776">
     <w:abstractNumId w:val="8"/>
   </w:num>
-  <w:num w:numId="23">
+  <w:num w:numId="23" w16cid:durableId="314454954">
     <w:abstractNumId w:val="22"/>
   </w:num>
-  <w:num w:numId="24">
+  <w:num w:numId="24" w16cid:durableId="1410229552">
     <w:abstractNumId w:val="14"/>
   </w:num>
-  <w:num w:numId="25">
+  <w:num w:numId="25" w16cid:durableId="132256031">
     <w:abstractNumId w:val="11"/>
   </w:num>
-  <w:num w:numId="26">
+  <w:num w:numId="26" w16cid:durableId="814302494">
     <w:abstractNumId w:val="4"/>
   </w:num>
-  <w:num w:numId="27">
+  <w:num w:numId="27" w16cid:durableId="686831955">
     <w:abstractNumId w:val="21"/>
   </w:num>
-  <w:num w:numId="28">
+  <w:num w:numId="28" w16cid:durableId="335116091">
     <w:abstractNumId w:val="12"/>
   </w:num>
-  <w:num w:numId="29">
+  <w:num w:numId="29" w16cid:durableId="1537809926">
     <w:abstractNumId w:val="7"/>
   </w:num>
-  <w:num w:numId="30">
+  <w:num w:numId="30" w16cid:durableId="1663972323">
     <w:abstractNumId w:val="27"/>
   </w:num>
-  <w:num w:numId="31">
+  <w:num w:numId="31" w16cid:durableId="1777142288">
     <w:abstractNumId w:val="39"/>
   </w:num>
-  <w:num w:numId="32">
+  <w:num w:numId="32" w16cid:durableId="1040204770">
     <w:abstractNumId w:val="10"/>
   </w:num>
-  <w:num w:numId="33">
+  <w:num w:numId="33" w16cid:durableId="1101343048">
     <w:abstractNumId w:val="29"/>
   </w:num>
-  <w:num w:numId="34">
+  <w:num w:numId="34" w16cid:durableId="649674098">
     <w:abstractNumId w:val="24"/>
   </w:num>
-  <w:num w:numId="35">
+  <w:num w:numId="35" w16cid:durableId="1178158444">
     <w:abstractNumId w:val="3"/>
   </w:num>
-  <w:num w:numId="36">
+  <w:num w:numId="36" w16cid:durableId="70976883">
     <w:abstractNumId w:val="13"/>
   </w:num>
-  <w:num w:numId="37">
+  <w:num w:numId="37" w16cid:durableId="849412489">
     <w:abstractNumId w:val="31"/>
   </w:num>
-  <w:num w:numId="38">
+  <w:num w:numId="38" w16cid:durableId="20055861">
     <w:abstractNumId w:val="9"/>
   </w:num>
-  <w:num w:numId="39">
+  <w:num w:numId="39" w16cid:durableId="477842919">
     <w:abstractNumId w:val="23"/>
   </w:num>
-  <w:num w:numId="40">
+  <w:num w:numId="40" w16cid:durableId="315762018">
     <w:abstractNumId w:val="19"/>
   </w:num>
-  <w:num w:numId="41">
+  <w:num w:numId="41" w16cid:durableId="1406030523">
     <w:abstractNumId w:val="33"/>
   </w:num>
 </w:numbering>
 </file>
 
 <file path=word/styles.xml><?xml version="1.0" encoding="utf-8"?>
-<w:styles xmlns:mc="http://schemas.openxmlformats.org/markup-compatibility/2006" xmlns:r="http://schemas.openxmlformats.org/officeDocument/2006/relationships" xmlns:w="http://schemas.openxmlformats.org/wordprocessingml/2006/main" xmlns:w14="http://schemas.microsoft.com/office/word/2010/wordml" xmlns:w15="http://schemas.microsoft.com/office/word/2012/wordml" mc:Ignorable="w14 w15">
+<w:styles xmlns:mc="http://schemas.openxmlformats.org/markup-compatibility/2006" xmlns:r="http://schemas.openxmlformats.org/officeDocument/2006/relationships" xmlns:w="http://schemas.openxmlformats.org/wordprocessingml/2006/main" xmlns:w14="http://schemas.microsoft.com/office/word/2010/wordml" xmlns:w15="http://schemas.microsoft.com/office/word/2012/wordml" xmlns:w16cex="http://schemas.microsoft.com/office/word/2018/wordml/cex" xmlns:w16cid="http://schemas.microsoft.com/office/word/2016/wordml/cid" xmlns:w16="http://schemas.microsoft.com/office/word/2018/wordml" xmlns:w16du="http://schemas.microsoft.com/office/word/2023/wordml/word16du" xmlns:w16sdtdh="http://schemas.microsoft.com/office/word/2020/wordml/sdtdatahash" xmlns:w16sdtfl="http://schemas.microsoft.com/office/word/2024/wordml/sdtformatlock" xmlns:w16se="http://schemas.microsoft.com/office/word/2015/wordml/symex" mc:Ignorable="w14 w15 w16se w16cid w16 w16cex w16sdtdh w16sdtfl w16du">
   <w:docDefaults>
     <w:rPrDefault>
       <w:rPr>
@@ -14425,7 +11930,7 @@
       </w:pPr>
     </w:pPrDefault>
   </w:docDefaults>
-  <w:latentStyles w:defLockedState="0" w:defUIPriority="99" w:defSemiHidden="0" w:defUnhideWhenUsed="0" w:defQFormat="0" w:count="371">
+  <w:latentStyles w:defLockedState="0" w:defUIPriority="99" w:defSemiHidden="0" w:defUnhideWhenUsed="0" w:defQFormat="0" w:count="376">
     <w:lsdException w:name="Normal" w:uiPriority="0" w:qFormat="1"/>
     <w:lsdException w:name="heading 1" w:uiPriority="9" w:qFormat="1"/>
     <w:lsdException w:name="heading 2" w:semiHidden="1" w:uiPriority="9" w:unhideWhenUsed="1" w:qFormat="1"/>
@@ -14797,6 +12302,11 @@
     <w:lsdException w:name="List Table 5 Dark Accent 6" w:uiPriority="50"/>
     <w:lsdException w:name="List Table 6 Colorful Accent 6" w:uiPriority="51"/>
     <w:lsdException w:name="List Table 7 Colorful Accent 6" w:uiPriority="52"/>
+    <w:lsdException w:name="Mention" w:semiHidden="1" w:unhideWhenUsed="1"/>
+    <w:lsdException w:name="Smart Hyperlink" w:semiHidden="1" w:unhideWhenUsed="1"/>
+    <w:lsdException w:name="Hashtag" w:semiHidden="1" w:unhideWhenUsed="1"/>
+    <w:lsdException w:name="Unresolved Mention" w:semiHidden="1" w:unhideWhenUsed="1"/>
+    <w:lsdException w:name="Smart Link" w:semiHidden="1" w:unhideWhenUsed="1"/>
   </w:latentStyles>
   <w:style w:type="paragraph" w:default="1" w:styleId="Normal">
     <w:name w:val="Normal"/>
@@ -15327,7 +12837,6 @@
       <w:spacing w:after="0" w:line="240" w:lineRule="auto"/>
     </w:pPr>
     <w:tblPr>
-      <w:tblInd w:w="0" w:type="dxa"/>
       <w:tblBorders>
         <w:top w:val="single" w:sz="4" w:space="0" w:color="auto"/>
         <w:left w:val="single" w:sz="4" w:space="0" w:color="auto"/>
@@ -15336,12 +12845,6 @@
         <w:insideH w:val="single" w:sz="4" w:space="0" w:color="auto"/>
         <w:insideV w:val="single" w:sz="4" w:space="0" w:color="auto"/>
       </w:tblBorders>
-      <w:tblCellMar>
-        <w:top w:w="0" w:type="dxa"/>
-        <w:left w:w="108" w:type="dxa"/>
-        <w:bottom w:w="0" w:type="dxa"/>
-        <w:right w:w="108" w:type="dxa"/>
-      </w:tblCellMar>
     </w:tblPr>
   </w:style>
   <w:style w:type="paragraph" w:styleId="Header">
@@ -15399,8 +12902,8 @@
       <w:u w:val="single"/>
     </w:rPr>
   </w:style>
-  <w:style w:type="character" w:customStyle="1" w:styleId="UnresolvedMention">
-    <w:name w:val="Unresolved Mention"/>
+  <w:style w:type="character" w:customStyle="1" w:styleId="UnresolvedMention1">
+    <w:name w:val="Unresolved Mention1"/>
     <w:basedOn w:val="DefaultParagraphFont"/>
     <w:uiPriority w:val="99"/>
     <w:semiHidden/>

</xml_diff>